<commit_message>
Tờ trình: cập nhật giá trị theo LOA Phục Hưng (214 tỷ chưa VAT) và HĐ mới bỏ công tác đất
Co-Authored-By: Claude Opus 5.5 <noreply@anthropic.com>
Claude-Session: https://claude.ai/code/session_013kfHyeUKSX8YviAMfNrZNJ
</commit_message>
<xml_diff>
--- a/3. DỰ THẢO HĐ/20.10.2026 Tờ trình phê duyệt giá trị và điều kiện HĐ phần ngầm - Phục Hưng.docx
+++ b/3. DỰ THẢO HĐ/20.10.2026 Tờ trình phê duyệt giá trị và điều kiện HĐ phần ngầm - Phục Hưng.docx
@@ -592,7 +592,7 @@
           <w:sz w:val="26"/>
           <w:szCs w:val="26"/>
         </w:rPr>
-        <w:t xml:space="preserve">+ Thư chấp thuận (LOA) số </w:t>
+        <w:t xml:space="preserve">+ Thông báo trúng thầu (LOA) số </w:t>
       </w:r>
       <w:r>
         <w:rPr>
@@ -613,7 +613,7 @@
           <w:sz w:val="26"/>
           <w:szCs w:val="26"/>
         </w:rPr>
-        <w:t xml:space="preserve"> ngày </w:t>
+        <w:t xml:space="preserve">/2026/CV/EC-XD ngày </w:t>
       </w:r>
       <w:r>
         <w:rPr>
@@ -634,7 +634,7 @@
           <w:sz w:val="26"/>
           <w:szCs w:val="26"/>
         </w:rPr>
-        <w:t xml:space="preserve"> gửi Công ty CP Xây dựng Phục Hưng Holdings;</w:t>
+        <w:t xml:space="preserve">/10/2026 gửi Công ty CP Xây dựng Phục Hưng Holdings, giá trúng thầu 214.000.000.000 đồng (chưa VAT), phạm vi gồm công tác đất và kết cấu phần ngầm;</w:t>
       </w:r>
     </w:p>
     <w:p>
@@ -737,9 +737,9 @@
       </w:tblPr>
       <w:tblGrid>
         <w:gridCol w:w="600"/>
-        <w:gridCol w:w="4700"/>
-        <w:gridCol w:w="2300"/>
-        <w:gridCol w:w="2000"/>
+        <w:gridCol w:w="4400"/>
+        <w:gridCol w:w="2500"/>
+        <w:gridCol w:w="2100"/>
       </w:tblGrid>
       <w:tr>
         <w:trPr>
@@ -783,7 +783,7 @@
         </w:tc>
         <w:tc>
           <w:tcPr>
-            <w:tcW w:type="dxa" w:w="4700"/>
+            <w:tcW w:type="dxa" w:w="4400"/>
             <w:tcBorders>
               <w:top w:val="single" w:color="000000" w:sz="4"/>
               <w:left w:val="single" w:color="000000" w:sz="4"/>
@@ -818,7 +818,7 @@
         </w:tc>
         <w:tc>
           <w:tcPr>
-            <w:tcW w:type="dxa" w:w="2300"/>
+            <w:tcW w:type="dxa" w:w="2500"/>
             <w:tcBorders>
               <w:top w:val="single" w:color="000000" w:sz="4"/>
               <w:left w:val="single" w:color="000000" w:sz="4"/>
@@ -847,13 +847,13 @@
                 <w:sz w:val="24"/>
                 <w:szCs w:val="24"/>
               </w:rPr>
-              <w:t xml:space="preserve">Giá trị (đồng)</w:t>
-            </w:r>
-          </w:p>
-        </w:tc>
-        <w:tc>
-          <w:tcPr>
-            <w:tcW w:type="dxa" w:w="2000"/>
+              <w:t xml:space="preserve">Giá trị trước VAT (đồng)</w:t>
+            </w:r>
+          </w:p>
+        </w:tc>
+        <w:tc>
+          <w:tcPr>
+            <w:tcW w:type="dxa" w:w="2100"/>
             <w:tcBorders>
               <w:top w:val="single" w:color="000000" w:sz="4"/>
               <w:left w:val="single" w:color="000000" w:sz="4"/>
@@ -928,41 +928,41 @@
         </w:tc>
         <w:tc>
           <w:tcPr>
-            <w:tcW w:type="dxa" w:w="4700"/>
-            <w:tcBorders>
-              <w:top w:val="single" w:color="000000" w:sz="4"/>
-              <w:left w:val="single" w:color="000000" w:sz="4"/>
-              <w:bottom w:val="single" w:color="000000" w:sz="4"/>
-              <w:right w:val="single" w:color="000000" w:sz="4"/>
-            </w:tcBorders>
-            <w:tcMar>
-              <w:top w:type="dxa" w:w="40"/>
-              <w:left w:type="dxa" w:w="90"/>
-              <w:bottom w:type="dxa" w:w="40"/>
-              <w:right w:type="dxa" w:w="90"/>
-            </w:tcMar>
-            <w:vAlign w:val="center"/>
-          </w:tcPr>
-          <w:p>
-            <w:pPr>
-              <w:spacing w:after="20" w:before="0" w:line="250"/>
-              <w:jc w:val="left"/>
-            </w:pPr>
-            <w:r>
-              <w:rPr>
-                <w:rFonts w:ascii="Times New Roman" w:cs="Times New Roman" w:eastAsia="Times New Roman" w:hAnsi="Times New Roman"/>
-                <w:b w:val="false"/>
-                <w:bCs w:val="false"/>
-                <w:sz w:val="24"/>
-                <w:szCs w:val="24"/>
-              </w:rPr>
-              <w:t xml:space="preserve">Dự toán gói thầu (theo LOA)</w:t>
-            </w:r>
-          </w:p>
-        </w:tc>
-        <w:tc>
-          <w:tcPr>
-            <w:tcW w:type="dxa" w:w="2300"/>
+            <w:tcW w:type="dxa" w:w="4400"/>
+            <w:tcBorders>
+              <w:top w:val="single" w:color="000000" w:sz="4"/>
+              <w:left w:val="single" w:color="000000" w:sz="4"/>
+              <w:bottom w:val="single" w:color="000000" w:sz="4"/>
+              <w:right w:val="single" w:color="000000" w:sz="4"/>
+            </w:tcBorders>
+            <w:tcMar>
+              <w:top w:type="dxa" w:w="40"/>
+              <w:left w:type="dxa" w:w="90"/>
+              <w:bottom w:type="dxa" w:w="40"/>
+              <w:right w:type="dxa" w:w="90"/>
+            </w:tcMar>
+            <w:vAlign w:val="center"/>
+          </w:tcPr>
+          <w:p>
+            <w:pPr>
+              <w:spacing w:after="20" w:before="0" w:line="250"/>
+              <w:jc w:val="left"/>
+            </w:pPr>
+            <w:r>
+              <w:rPr>
+                <w:rFonts w:ascii="Times New Roman" w:cs="Times New Roman" w:eastAsia="Times New Roman" w:hAnsi="Times New Roman"/>
+                <w:b w:val="false"/>
+                <w:bCs w:val="false"/>
+                <w:sz w:val="24"/>
+                <w:szCs w:val="24"/>
+              </w:rPr>
+              <w:t xml:space="preserve">Giá trúng thầu theo LOA (gồm công tác đất)</w:t>
+            </w:r>
+          </w:p>
+        </w:tc>
+        <w:tc>
+          <w:tcPr>
+            <w:tcW w:type="dxa" w:w="2500"/>
             <w:tcBorders>
               <w:top w:val="single" w:color="000000" w:sz="4"/>
               <w:left w:val="single" w:color="000000" w:sz="4"/>
@@ -989,43 +989,42 @@
                 <w:bCs w:val="false"/>
                 <w:sz w:val="24"/>
                 <w:szCs w:val="24"/>
-                <w:highlight w:val="yellow"/>
-              </w:rPr>
-              <w:t xml:space="preserve">……</w:t>
-            </w:r>
-          </w:p>
-        </w:tc>
-        <w:tc>
-          <w:tcPr>
-            <w:tcW w:type="dxa" w:w="2000"/>
-            <w:tcBorders>
-              <w:top w:val="single" w:color="000000" w:sz="4"/>
-              <w:left w:val="single" w:color="000000" w:sz="4"/>
-              <w:bottom w:val="single" w:color="000000" w:sz="4"/>
-              <w:right w:val="single" w:color="000000" w:sz="4"/>
-            </w:tcBorders>
-            <w:tcMar>
-              <w:top w:type="dxa" w:w="40"/>
-              <w:left w:type="dxa" w:w="90"/>
-              <w:bottom w:type="dxa" w:w="40"/>
-              <w:right w:type="dxa" w:w="90"/>
-            </w:tcMar>
-            <w:vAlign w:val="center"/>
-          </w:tcPr>
-          <w:p>
-            <w:pPr>
-              <w:spacing w:after="20" w:before="0" w:line="250"/>
-              <w:jc w:val="left"/>
-            </w:pPr>
-            <w:r>
-              <w:rPr>
-                <w:rFonts w:ascii="Times New Roman" w:cs="Times New Roman" w:eastAsia="Times New Roman" w:hAnsi="Times New Roman"/>
-                <w:b w:val="false"/>
-                <w:bCs w:val="false"/>
-                <w:sz w:val="24"/>
-                <w:szCs w:val="24"/>
-              </w:rPr>
-              <w:t xml:space="preserve">Đã gồm VAT 8%</w:t>
+              </w:rPr>
+              <w:t xml:space="preserve">214.000.000.000</w:t>
+            </w:r>
+          </w:p>
+        </w:tc>
+        <w:tc>
+          <w:tcPr>
+            <w:tcW w:type="dxa" w:w="2100"/>
+            <w:tcBorders>
+              <w:top w:val="single" w:color="000000" w:sz="4"/>
+              <w:left w:val="single" w:color="000000" w:sz="4"/>
+              <w:bottom w:val="single" w:color="000000" w:sz="4"/>
+              <w:right w:val="single" w:color="000000" w:sz="4"/>
+            </w:tcBorders>
+            <w:tcMar>
+              <w:top w:type="dxa" w:w="40"/>
+              <w:left w:type="dxa" w:w="90"/>
+              <w:bottom w:type="dxa" w:w="40"/>
+              <w:right w:type="dxa" w:w="90"/>
+            </w:tcMar>
+            <w:vAlign w:val="center"/>
+          </w:tcPr>
+          <w:p>
+            <w:pPr>
+              <w:spacing w:after="20" w:before="0" w:line="250"/>
+              <w:jc w:val="left"/>
+            </w:pPr>
+            <w:r>
+              <w:rPr>
+                <w:rFonts w:ascii="Times New Roman" w:cs="Times New Roman" w:eastAsia="Times New Roman" w:hAnsi="Times New Roman"/>
+                <w:b w:val="false"/>
+                <w:bCs w:val="false"/>
+                <w:sz w:val="24"/>
+                <w:szCs w:val="24"/>
+              </w:rPr>
+              <w:t xml:space="preserve">Chưa VAT</w:t>
             </w:r>
           </w:p>
         </w:tc>
@@ -1071,41 +1070,41 @@
         </w:tc>
         <w:tc>
           <w:tcPr>
-            <w:tcW w:type="dxa" w:w="4700"/>
-            <w:tcBorders>
-              <w:top w:val="single" w:color="000000" w:sz="4"/>
-              <w:left w:val="single" w:color="000000" w:sz="4"/>
-              <w:bottom w:val="single" w:color="000000" w:sz="4"/>
-              <w:right w:val="single" w:color="000000" w:sz="4"/>
-            </w:tcBorders>
-            <w:tcMar>
-              <w:top w:type="dxa" w:w="40"/>
-              <w:left w:type="dxa" w:w="90"/>
-              <w:bottom w:type="dxa" w:w="40"/>
-              <w:right w:type="dxa" w:w="90"/>
-            </w:tcMar>
-            <w:vAlign w:val="center"/>
-          </w:tcPr>
-          <w:p>
-            <w:pPr>
-              <w:spacing w:after="20" w:before="0" w:line="250"/>
-              <w:jc w:val="left"/>
-            </w:pPr>
-            <w:r>
-              <w:rPr>
-                <w:rFonts w:ascii="Times New Roman" w:cs="Times New Roman" w:eastAsia="Times New Roman" w:hAnsi="Times New Roman"/>
-                <w:b w:val="false"/>
-                <w:bCs w:val="false"/>
-                <w:sz w:val="24"/>
-                <w:szCs w:val="24"/>
-              </w:rPr>
-              <w:t xml:space="preserve">Giá trị theo dự thảo HĐ ngày 19/10/2026</w:t>
-            </w:r>
-          </w:p>
-        </w:tc>
-        <w:tc>
-          <w:tcPr>
-            <w:tcW w:type="dxa" w:w="2300"/>
+            <w:tcW w:type="dxa" w:w="4400"/>
+            <w:tcBorders>
+              <w:top w:val="single" w:color="000000" w:sz="4"/>
+              <w:left w:val="single" w:color="000000" w:sz="4"/>
+              <w:bottom w:val="single" w:color="000000" w:sz="4"/>
+              <w:right w:val="single" w:color="000000" w:sz="4"/>
+            </w:tcBorders>
+            <w:tcMar>
+              <w:top w:type="dxa" w:w="40"/>
+              <w:left w:type="dxa" w:w="90"/>
+              <w:bottom w:type="dxa" w:w="40"/>
+              <w:right w:type="dxa" w:w="90"/>
+            </w:tcMar>
+            <w:vAlign w:val="center"/>
+          </w:tcPr>
+          <w:p>
+            <w:pPr>
+              <w:spacing w:after="20" w:before="0" w:line="250"/>
+              <w:jc w:val="left"/>
+            </w:pPr>
+            <w:r>
+              <w:rPr>
+                <w:rFonts w:ascii="Times New Roman" w:cs="Times New Roman" w:eastAsia="Times New Roman" w:hAnsi="Times New Roman"/>
+                <w:b w:val="false"/>
+                <w:bCs w:val="false"/>
+                <w:sz w:val="24"/>
+                <w:szCs w:val="24"/>
+              </w:rPr>
+              <w:t xml:space="preserve">Giá trị hợp đồng mới (bỏ công tác đất)</w:t>
+            </w:r>
+          </w:p>
+        </w:tc>
+        <w:tc>
+          <w:tcPr>
+            <w:tcW w:type="dxa" w:w="2500"/>
             <w:tcBorders>
               <w:top w:val="single" w:color="000000" w:sz="4"/>
               <w:left w:val="single" w:color="000000" w:sz="4"/>
@@ -1133,41 +1132,41 @@
                 <w:sz w:val="24"/>
                 <w:szCs w:val="24"/>
               </w:rPr>
-              <w:t xml:space="preserve">216.339.068.583</w:t>
-            </w:r>
-          </w:p>
-        </w:tc>
-        <w:tc>
-          <w:tcPr>
-            <w:tcW w:type="dxa" w:w="2000"/>
-            <w:tcBorders>
-              <w:top w:val="single" w:color="000000" w:sz="4"/>
-              <w:left w:val="single" w:color="000000" w:sz="4"/>
-              <w:bottom w:val="single" w:color="000000" w:sz="4"/>
-              <w:right w:val="single" w:color="000000" w:sz="4"/>
-            </w:tcBorders>
-            <w:tcMar>
-              <w:top w:type="dxa" w:w="40"/>
-              <w:left w:type="dxa" w:w="90"/>
-              <w:bottom w:type="dxa" w:w="40"/>
-              <w:right w:type="dxa" w:w="90"/>
-            </w:tcMar>
-            <w:vAlign w:val="center"/>
-          </w:tcPr>
-          <w:p>
-            <w:pPr>
-              <w:spacing w:after="20" w:before="0" w:line="250"/>
-              <w:jc w:val="left"/>
-            </w:pPr>
-            <w:r>
-              <w:rPr>
-                <w:rFonts w:ascii="Times New Roman" w:cs="Times New Roman" w:eastAsia="Times New Roman" w:hAnsi="Times New Roman"/>
-                <w:b w:val="false"/>
-                <w:bCs w:val="false"/>
-                <w:sz w:val="24"/>
-                <w:szCs w:val="24"/>
-              </w:rPr>
-              <w:t xml:space="preserve">Trước thuế 200.313.952.392</w:t>
+              <w:t xml:space="preserve">200.313.952.392</w:t>
+            </w:r>
+          </w:p>
+        </w:tc>
+        <w:tc>
+          <w:tcPr>
+            <w:tcW w:type="dxa" w:w="2100"/>
+            <w:tcBorders>
+              <w:top w:val="single" w:color="000000" w:sz="4"/>
+              <w:left w:val="single" w:color="000000" w:sz="4"/>
+              <w:bottom w:val="single" w:color="000000" w:sz="4"/>
+              <w:right w:val="single" w:color="000000" w:sz="4"/>
+            </w:tcBorders>
+            <w:tcMar>
+              <w:top w:type="dxa" w:w="40"/>
+              <w:left w:type="dxa" w:w="90"/>
+              <w:bottom w:type="dxa" w:w="40"/>
+              <w:right w:type="dxa" w:w="90"/>
+            </w:tcMar>
+            <w:vAlign w:val="center"/>
+          </w:tcPr>
+          <w:p>
+            <w:pPr>
+              <w:spacing w:after="20" w:before="0" w:line="250"/>
+              <w:jc w:val="left"/>
+            </w:pPr>
+            <w:r>
+              <w:rPr>
+                <w:rFonts w:ascii="Times New Roman" w:cs="Times New Roman" w:eastAsia="Times New Roman" w:hAnsi="Times New Roman"/>
+                <w:b w:val="false"/>
+                <w:bCs w:val="false"/>
+                <w:sz w:val="24"/>
+                <w:szCs w:val="24"/>
+              </w:rPr>
+              <w:t xml:space="preserve">Sau VAT 8%: 216.339.068.583</w:t>
             </w:r>
           </w:p>
         </w:tc>
@@ -1213,41 +1212,41 @@
         </w:tc>
         <w:tc>
           <w:tcPr>
-            <w:tcW w:type="dxa" w:w="4700"/>
-            <w:tcBorders>
-              <w:top w:val="single" w:color="000000" w:sz="4"/>
-              <w:left w:val="single" w:color="000000" w:sz="4"/>
-              <w:bottom w:val="single" w:color="000000" w:sz="4"/>
-              <w:right w:val="single" w:color="000000" w:sz="4"/>
-            </w:tcBorders>
-            <w:tcMar>
-              <w:top w:type="dxa" w:w="40"/>
-              <w:left w:type="dxa" w:w="90"/>
-              <w:bottom w:type="dxa" w:w="40"/>
-              <w:right w:type="dxa" w:w="90"/>
-            </w:tcMar>
-            <w:vAlign w:val="center"/>
-          </w:tcPr>
-          <w:p>
-            <w:pPr>
-              <w:spacing w:after="20" w:before="0" w:line="250"/>
-              <w:jc w:val="left"/>
-            </w:pPr>
-            <w:r>
-              <w:rPr>
-                <w:rFonts w:ascii="Times New Roman" w:cs="Times New Roman" w:eastAsia="Times New Roman" w:hAnsi="Times New Roman"/>
-                <w:b w:val="false"/>
-                <w:bCs w:val="false"/>
-                <w:sz w:val="24"/>
-                <w:szCs w:val="24"/>
-              </w:rPr>
-              <w:t xml:space="preserve">Giá trị hợp đồng đề xuất phê duyệt</w:t>
-            </w:r>
-          </w:p>
-        </w:tc>
-        <w:tc>
-          <w:tcPr>
-            <w:tcW w:type="dxa" w:w="2300"/>
+            <w:tcW w:type="dxa" w:w="4400"/>
+            <w:tcBorders>
+              <w:top w:val="single" w:color="000000" w:sz="4"/>
+              <w:left w:val="single" w:color="000000" w:sz="4"/>
+              <w:bottom w:val="single" w:color="000000" w:sz="4"/>
+              <w:right w:val="single" w:color="000000" w:sz="4"/>
+            </w:tcBorders>
+            <w:tcMar>
+              <w:top w:type="dxa" w:w="40"/>
+              <w:left w:type="dxa" w:w="90"/>
+              <w:bottom w:type="dxa" w:w="40"/>
+              <w:right w:type="dxa" w:w="90"/>
+            </w:tcMar>
+            <w:vAlign w:val="center"/>
+          </w:tcPr>
+          <w:p>
+            <w:pPr>
+              <w:spacing w:after="20" w:before="0" w:line="250"/>
+              <w:jc w:val="left"/>
+            </w:pPr>
+            <w:r>
+              <w:rPr>
+                <w:rFonts w:ascii="Times New Roman" w:cs="Times New Roman" w:eastAsia="Times New Roman" w:hAnsi="Times New Roman"/>
+                <w:b w:val="false"/>
+                <w:bCs w:val="false"/>
+                <w:sz w:val="24"/>
+                <w:szCs w:val="24"/>
+              </w:rPr>
+              <w:t xml:space="preserve">Chênh lệch giảm (1 − 2)</w:t>
+            </w:r>
+          </w:p>
+        </w:tc>
+        <w:tc>
+          <w:tcPr>
+            <w:tcW w:type="dxa" w:w="2500"/>
             <w:tcBorders>
               <w:top w:val="single" w:color="000000" w:sz="4"/>
               <w:left w:val="single" w:color="000000" w:sz="4"/>
@@ -1274,43 +1273,42 @@
                 <w:bCs w:val="false"/>
                 <w:sz w:val="24"/>
                 <w:szCs w:val="24"/>
-                <w:highlight w:val="yellow"/>
-              </w:rPr>
-              <w:t xml:space="preserve">≈ 214.000.000.000</w:t>
-            </w:r>
-          </w:p>
-        </w:tc>
-        <w:tc>
-          <w:tcPr>
-            <w:tcW w:type="dxa" w:w="2000"/>
-            <w:tcBorders>
-              <w:top w:val="single" w:color="000000" w:sz="4"/>
-              <w:left w:val="single" w:color="000000" w:sz="4"/>
-              <w:bottom w:val="single" w:color="000000" w:sz="4"/>
-              <w:right w:val="single" w:color="000000" w:sz="4"/>
-            </w:tcBorders>
-            <w:tcMar>
-              <w:top w:type="dxa" w:w="40"/>
-              <w:left w:type="dxa" w:w="90"/>
-              <w:bottom w:type="dxa" w:w="40"/>
-              <w:right w:type="dxa" w:w="90"/>
-            </w:tcMar>
-            <w:vAlign w:val="center"/>
-          </w:tcPr>
-          <w:p>
-            <w:pPr>
-              <w:spacing w:after="20" w:before="0" w:line="250"/>
-              <w:jc w:val="left"/>
-            </w:pPr>
-            <w:r>
-              <w:rPr>
-                <w:rFonts w:ascii="Times New Roman" w:cs="Times New Roman" w:eastAsia="Times New Roman" w:hAnsi="Times New Roman"/>
-                <w:b w:val="false"/>
-                <w:bCs w:val="false"/>
-                <w:sz w:val="24"/>
-                <w:szCs w:val="24"/>
-              </w:rPr>
-              <w:t xml:space="preserve">Đã gồm VAT 8%, tạm tính</w:t>
+              </w:rPr>
+              <w:t xml:space="preserve">13.686.047.608</w:t>
+            </w:r>
+          </w:p>
+        </w:tc>
+        <w:tc>
+          <w:tcPr>
+            <w:tcW w:type="dxa" w:w="2100"/>
+            <w:tcBorders>
+              <w:top w:val="single" w:color="000000" w:sz="4"/>
+              <w:left w:val="single" w:color="000000" w:sz="4"/>
+              <w:bottom w:val="single" w:color="000000" w:sz="4"/>
+              <w:right w:val="single" w:color="000000" w:sz="4"/>
+            </w:tcBorders>
+            <w:tcMar>
+              <w:top w:type="dxa" w:w="40"/>
+              <w:left w:type="dxa" w:w="90"/>
+              <w:bottom w:type="dxa" w:w="40"/>
+              <w:right w:type="dxa" w:w="90"/>
+            </w:tcMar>
+            <w:vAlign w:val="center"/>
+          </w:tcPr>
+          <w:p>
+            <w:pPr>
+              <w:spacing w:after="20" w:before="0" w:line="250"/>
+              <w:jc w:val="left"/>
+            </w:pPr>
+            <w:r>
+              <w:rPr>
+                <w:rFonts w:ascii="Times New Roman" w:cs="Times New Roman" w:eastAsia="Times New Roman" w:hAnsi="Times New Roman"/>
+                <w:b w:val="false"/>
+                <w:bCs w:val="false"/>
+                <w:sz w:val="24"/>
+                <w:szCs w:val="24"/>
+              </w:rPr>
+              <w:t xml:space="preserve">Giảm 6,40% so với LOA</w:t>
             </w:r>
           </w:p>
         </w:tc>
@@ -1356,41 +1354,41 @@
         </w:tc>
         <w:tc>
           <w:tcPr>
-            <w:tcW w:type="dxa" w:w="4700"/>
-            <w:tcBorders>
-              <w:top w:val="single" w:color="000000" w:sz="4"/>
-              <w:left w:val="single" w:color="000000" w:sz="4"/>
-              <w:bottom w:val="single" w:color="000000" w:sz="4"/>
-              <w:right w:val="single" w:color="000000" w:sz="4"/>
-            </w:tcBorders>
-            <w:tcMar>
-              <w:top w:type="dxa" w:w="40"/>
-              <w:left w:type="dxa" w:w="90"/>
-              <w:bottom w:type="dxa" w:w="40"/>
-              <w:right w:type="dxa" w:w="90"/>
-            </w:tcMar>
-            <w:vAlign w:val="center"/>
-          </w:tcPr>
-          <w:p>
-            <w:pPr>
-              <w:spacing w:after="20" w:before="0" w:line="250"/>
-              <w:jc w:val="left"/>
-            </w:pPr>
-            <w:r>
-              <w:rPr>
-                <w:rFonts w:ascii="Times New Roman" w:cs="Times New Roman" w:eastAsia="Times New Roman" w:hAnsi="Times New Roman"/>
-                <w:b w:val="false"/>
-                <w:bCs w:val="false"/>
-                <w:sz w:val="24"/>
-                <w:szCs w:val="24"/>
-              </w:rPr>
-              <w:t xml:space="preserve">Giảm so với dự toán = (1 − 3)/1</w:t>
-            </w:r>
-          </w:p>
-        </w:tc>
-        <w:tc>
-          <w:tcPr>
-            <w:tcW w:type="dxa" w:w="2300"/>
+            <w:tcW w:type="dxa" w:w="4400"/>
+            <w:tcBorders>
+              <w:top w:val="single" w:color="000000" w:sz="4"/>
+              <w:left w:val="single" w:color="000000" w:sz="4"/>
+              <w:bottom w:val="single" w:color="000000" w:sz="4"/>
+              <w:right w:val="single" w:color="000000" w:sz="4"/>
+            </w:tcBorders>
+            <w:tcMar>
+              <w:top w:type="dxa" w:w="40"/>
+              <w:left w:type="dxa" w:w="90"/>
+              <w:bottom w:type="dxa" w:w="40"/>
+              <w:right w:type="dxa" w:w="90"/>
+            </w:tcMar>
+            <w:vAlign w:val="center"/>
+          </w:tcPr>
+          <w:p>
+            <w:pPr>
+              <w:spacing w:after="20" w:before="0" w:line="250"/>
+              <w:jc w:val="left"/>
+            </w:pPr>
+            <w:r>
+              <w:rPr>
+                <w:rFonts w:ascii="Times New Roman" w:cs="Times New Roman" w:eastAsia="Times New Roman" w:hAnsi="Times New Roman"/>
+                <w:b w:val="false"/>
+                <w:bCs w:val="false"/>
+                <w:sz w:val="24"/>
+                <w:szCs w:val="24"/>
+              </w:rPr>
+              <w:t xml:space="preserve">Dự toán gói thầu</w:t>
+            </w:r>
+          </w:p>
+        </w:tc>
+        <w:tc>
+          <w:tcPr>
+            <w:tcW w:type="dxa" w:w="2500"/>
             <w:tcBorders>
               <w:top w:val="single" w:color="000000" w:sz="4"/>
               <w:left w:val="single" w:color="000000" w:sz="4"/>
@@ -1421,191 +1419,60 @@
               </w:rPr>
               <w:t xml:space="preserve">……</w:t>
             </w:r>
-            <w:r>
-              <w:rPr>
-                <w:rFonts w:ascii="Times New Roman" w:cs="Times New Roman" w:eastAsia="Times New Roman" w:hAnsi="Times New Roman"/>
-                <w:b w:val="false"/>
-                <w:bCs w:val="false"/>
-                <w:sz w:val="24"/>
-                <w:szCs w:val="24"/>
-              </w:rPr>
-              <w:t xml:space="preserve"> %</w:t>
-            </w:r>
-          </w:p>
-        </w:tc>
-        <w:tc>
-          <w:tcPr>
-            <w:tcW w:type="dxa" w:w="2000"/>
-            <w:tcBorders>
-              <w:top w:val="single" w:color="000000" w:sz="4"/>
-              <w:left w:val="single" w:color="000000" w:sz="4"/>
-              <w:bottom w:val="single" w:color="000000" w:sz="4"/>
-              <w:right w:val="single" w:color="000000" w:sz="4"/>
-            </w:tcBorders>
-            <w:tcMar>
-              <w:top w:type="dxa" w:w="40"/>
-              <w:left w:type="dxa" w:w="90"/>
-              <w:bottom w:type="dxa" w:w="40"/>
-              <w:right w:type="dxa" w:w="90"/>
-            </w:tcMar>
-            <w:vAlign w:val="center"/>
-          </w:tcPr>
-          <w:p>
-            <w:pPr>
-              <w:spacing w:after="20" w:before="0" w:line="250"/>
-              <w:jc w:val="left"/>
-            </w:pPr>
-            <w:r>
-              <w:rPr>
-                <w:rFonts w:ascii="Times New Roman" w:cs="Times New Roman" w:eastAsia="Times New Roman" w:hAnsi="Times New Roman"/>
-                <w:b w:val="false"/>
-                <w:bCs w:val="false"/>
-                <w:sz w:val="24"/>
-                <w:szCs w:val="24"/>
-              </w:rPr>
-              <w:t xml:space="preserve">Mục tiêu ≈ 4,8%</w:t>
-            </w:r>
-          </w:p>
-        </w:tc>
-      </w:tr>
-      <w:tr>
-        <w:trPr>
-          <w:cantSplit/>
-          <w:tblHeader w:val="false"/>
-        </w:trPr>
-        <w:tc>
-          <w:tcPr>
-            <w:tcW w:type="dxa" w:w="600"/>
-            <w:tcBorders>
-              <w:top w:val="single" w:color="000000" w:sz="4"/>
-              <w:left w:val="single" w:color="000000" w:sz="4"/>
-              <w:bottom w:val="single" w:color="000000" w:sz="4"/>
-              <w:right w:val="single" w:color="000000" w:sz="4"/>
-            </w:tcBorders>
-            <w:tcMar>
-              <w:top w:type="dxa" w:w="40"/>
-              <w:left w:type="dxa" w:w="90"/>
-              <w:bottom w:type="dxa" w:w="40"/>
-              <w:right w:type="dxa" w:w="90"/>
-            </w:tcMar>
-            <w:vAlign w:val="center"/>
-          </w:tcPr>
-          <w:p>
-            <w:pPr>
-              <w:spacing w:after="20" w:before="0" w:line="250"/>
-              <w:jc w:val="center"/>
-            </w:pPr>
-            <w:r>
-              <w:rPr>
-                <w:rFonts w:ascii="Times New Roman" w:cs="Times New Roman" w:eastAsia="Times New Roman" w:hAnsi="Times New Roman"/>
-                <w:b w:val="false"/>
-                <w:bCs w:val="false"/>
-                <w:sz w:val="24"/>
-                <w:szCs w:val="24"/>
-              </w:rPr>
-              <w:t xml:space="preserve">5</w:t>
-            </w:r>
-          </w:p>
-        </w:tc>
-        <w:tc>
-          <w:tcPr>
-            <w:tcW w:type="dxa" w:w="4700"/>
-            <w:tcBorders>
-              <w:top w:val="single" w:color="000000" w:sz="4"/>
-              <w:left w:val="single" w:color="000000" w:sz="4"/>
-              <w:bottom w:val="single" w:color="000000" w:sz="4"/>
-              <w:right w:val="single" w:color="000000" w:sz="4"/>
-            </w:tcBorders>
-            <w:tcMar>
-              <w:top w:type="dxa" w:w="40"/>
-              <w:left w:type="dxa" w:w="90"/>
-              <w:bottom w:type="dxa" w:w="40"/>
-              <w:right w:type="dxa" w:w="90"/>
-            </w:tcMar>
-            <w:vAlign w:val="center"/>
-          </w:tcPr>
-          <w:p>
-            <w:pPr>
-              <w:spacing w:after="20" w:before="0" w:line="250"/>
-              <w:jc w:val="left"/>
-            </w:pPr>
-            <w:r>
-              <w:rPr>
-                <w:rFonts w:ascii="Times New Roman" w:cs="Times New Roman" w:eastAsia="Times New Roman" w:hAnsi="Times New Roman"/>
-                <w:b w:val="false"/>
-                <w:bCs w:val="false"/>
-                <w:sz w:val="24"/>
-                <w:szCs w:val="24"/>
-              </w:rPr>
-              <w:t xml:space="preserve">Giảm so với dự thảo 19/10 = (2 − 3)/2</w:t>
-            </w:r>
-          </w:p>
-        </w:tc>
-        <w:tc>
-          <w:tcPr>
-            <w:tcW w:type="dxa" w:w="2300"/>
-            <w:tcBorders>
-              <w:top w:val="single" w:color="000000" w:sz="4"/>
-              <w:left w:val="single" w:color="000000" w:sz="4"/>
-              <w:bottom w:val="single" w:color="000000" w:sz="4"/>
-              <w:right w:val="single" w:color="000000" w:sz="4"/>
-            </w:tcBorders>
-            <w:tcMar>
-              <w:top w:type="dxa" w:w="40"/>
-              <w:left w:type="dxa" w:w="90"/>
-              <w:bottom w:type="dxa" w:w="40"/>
-              <w:right w:type="dxa" w:w="90"/>
-            </w:tcMar>
-            <w:vAlign w:val="center"/>
-          </w:tcPr>
-          <w:p>
-            <w:pPr>
-              <w:spacing w:after="20" w:before="0" w:line="250"/>
-              <w:jc w:val="right"/>
-            </w:pPr>
-            <w:r>
-              <w:rPr>
-                <w:rFonts w:ascii="Times New Roman" w:cs="Times New Roman" w:eastAsia="Times New Roman" w:hAnsi="Times New Roman"/>
-                <w:b w:val="false"/>
-                <w:bCs w:val="false"/>
-                <w:sz w:val="24"/>
-                <w:szCs w:val="24"/>
-              </w:rPr>
-              <w:t xml:space="preserve">≈ 1,08 %</w:t>
-            </w:r>
-          </w:p>
-        </w:tc>
-        <w:tc>
-          <w:tcPr>
-            <w:tcW w:type="dxa" w:w="2000"/>
-            <w:tcBorders>
-              <w:top w:val="single" w:color="000000" w:sz="4"/>
-              <w:left w:val="single" w:color="000000" w:sz="4"/>
-              <w:bottom w:val="single" w:color="000000" w:sz="4"/>
-              <w:right w:val="single" w:color="000000" w:sz="4"/>
-            </w:tcBorders>
-            <w:tcMar>
-              <w:top w:type="dxa" w:w="40"/>
-              <w:left w:type="dxa" w:w="90"/>
-              <w:bottom w:type="dxa" w:w="40"/>
-              <w:right w:type="dxa" w:w="90"/>
-            </w:tcMar>
-            <w:vAlign w:val="center"/>
-          </w:tcPr>
-          <w:p>
-            <w:pPr>
-              <w:spacing w:after="20" w:before="0" w:line="250"/>
-              <w:jc w:val="left"/>
-            </w:pPr>
-            <w:r>
-              <w:rPr>
-                <w:rFonts w:ascii="Times New Roman" w:cs="Times New Roman" w:eastAsia="Times New Roman" w:hAnsi="Times New Roman"/>
-                <w:b w:val="false"/>
-                <w:bCs w:val="false"/>
-                <w:sz w:val="24"/>
-                <w:szCs w:val="24"/>
-              </w:rPr>
-              <w:t xml:space="preserve">≈ 2,34 tỷ đồng</w:t>
+          </w:p>
+        </w:tc>
+        <w:tc>
+          <w:tcPr>
+            <w:tcW w:type="dxa" w:w="2100"/>
+            <w:tcBorders>
+              <w:top w:val="single" w:color="000000" w:sz="4"/>
+              <w:left w:val="single" w:color="000000" w:sz="4"/>
+              <w:bottom w:val="single" w:color="000000" w:sz="4"/>
+              <w:right w:val="single" w:color="000000" w:sz="4"/>
+            </w:tcBorders>
+            <w:tcMar>
+              <w:top w:type="dxa" w:w="40"/>
+              <w:left w:type="dxa" w:w="90"/>
+              <w:bottom w:type="dxa" w:w="40"/>
+              <w:right w:type="dxa" w:w="90"/>
+            </w:tcMar>
+            <w:vAlign w:val="center"/>
+          </w:tcPr>
+          <w:p>
+            <w:pPr>
+              <w:spacing w:after="20" w:before="0" w:line="250"/>
+              <w:jc w:val="left"/>
+            </w:pPr>
+            <w:r>
+              <w:rPr>
+                <w:rFonts w:ascii="Times New Roman" w:cs="Times New Roman" w:eastAsia="Times New Roman" w:hAnsi="Times New Roman"/>
+                <w:b w:val="false"/>
+                <w:bCs w:val="false"/>
+                <w:sz w:val="24"/>
+                <w:szCs w:val="24"/>
+              </w:rPr>
+              <w:t xml:space="preserve">Giảm so với dự toán: </w:t>
+            </w:r>
+            <w:r>
+              <w:rPr>
+                <w:rFonts w:ascii="Times New Roman" w:cs="Times New Roman" w:eastAsia="Times New Roman" w:hAnsi="Times New Roman"/>
+                <w:b w:val="false"/>
+                <w:bCs w:val="false"/>
+                <w:sz w:val="24"/>
+                <w:szCs w:val="24"/>
+                <w:highlight w:val="yellow"/>
+              </w:rPr>
+              <w:t xml:space="preserve">……</w:t>
+            </w:r>
+            <w:r>
+              <w:rPr>
+                <w:rFonts w:ascii="Times New Roman" w:cs="Times New Roman" w:eastAsia="Times New Roman" w:hAnsi="Times New Roman"/>
+                <w:b w:val="false"/>
+                <w:bCs w:val="false"/>
+                <w:sz w:val="24"/>
+                <w:szCs w:val="24"/>
+              </w:rPr>
+              <w:t xml:space="preserve">%</w:t>
             </w:r>
           </w:p>
         </w:tc>
@@ -1626,7 +1493,7 @@
           <w:sz w:val="24"/>
           <w:szCs w:val="24"/>
         </w:rPr>
-        <w:t xml:space="preserve">Kiểm tra tỷ lệ 4,8%:</w:t>
+        <w:t xml:space="preserve">Kiểm tra tỷ lệ:</w:t>
       </w:r>
       <w:r>
         <w:rPr>
@@ -1638,7 +1505,31 @@
           <w:sz w:val="24"/>
           <w:szCs w:val="24"/>
         </w:rPr>
-        <w:t xml:space="preserve"> nếu giá trị hợp đồng là 214 tỷ đồng và giảm 4,8% so với dự toán thì dự toán phải ≈ 224,79 tỷ đồng (214 / 0,952). Đề nghị đối chiếu với giá trị dự toán tại LOA; nếu dự toán khác con số này thì tỷ lệ giảm thực tế cần tính lại theo công thức tại dòng 4.</w:t>
+        <w:t xml:space="preserve"> so với giá trúng thầu tại LOA, giá trị hợp đồng mới giảm </w:t>
+      </w:r>
+      <w:r>
+        <w:rPr>
+          <w:rFonts w:ascii="Times New Roman" w:cs="Times New Roman" w:eastAsia="Times New Roman" w:hAnsi="Times New Roman"/>
+          <w:b/>
+          <w:bCs/>
+          <w:i/>
+          <w:iCs/>
+          <w:sz w:val="24"/>
+          <w:szCs w:val="24"/>
+        </w:rPr>
+        <w:t xml:space="preserve">6,40%</w:t>
+      </w:r>
+      <w:r>
+        <w:rPr>
+          <w:rFonts w:ascii="Times New Roman" w:cs="Times New Roman" w:eastAsia="Times New Roman" w:hAnsi="Times New Roman"/>
+          <w:b w:val="false"/>
+          <w:bCs w:val="false"/>
+          <w:i/>
+          <w:iCs/>
+          <w:sz w:val="24"/>
+          <w:szCs w:val="24"/>
+        </w:rPr>
+        <w:t xml:space="preserve"> (không phải 4,8%). LOA không ghi giá trị dự toán; nếu tỷ lệ 4,8% là so với dự toán thì dự toán (trước VAT) phải ≈ 210,41 tỷ đồng (200,31 / 0,952) – đề nghị đối chiếu với dự toán được duyệt.</w:t>
       </w:r>
     </w:p>
     <w:p>
@@ -1910,28 +1801,7 @@
                 <w:sz w:val="24"/>
                 <w:szCs w:val="24"/>
               </w:rPr>
-              <w:t xml:space="preserve"> giá trị HĐ trước thuế (≈ </w:t>
-            </w:r>
-            <w:r>
-              <w:rPr>
-                <w:rFonts w:ascii="Times New Roman" w:cs="Times New Roman" w:eastAsia="Times New Roman" w:hAnsi="Times New Roman"/>
-                <w:b w:val="false"/>
-                <w:bCs w:val="false"/>
-                <w:sz w:val="24"/>
-                <w:szCs w:val="24"/>
-                <w:highlight w:val="yellow"/>
-              </w:rPr>
-              <w:t xml:space="preserve">49,54</w:t>
-            </w:r>
-            <w:r>
-              <w:rPr>
-                <w:rFonts w:ascii="Times New Roman" w:cs="Times New Roman" w:eastAsia="Times New Roman" w:hAnsi="Times New Roman"/>
-                <w:b w:val="false"/>
-                <w:bCs w:val="false"/>
-                <w:sz w:val="24"/>
-                <w:szCs w:val="24"/>
-              </w:rPr>
-              <w:t xml:space="preserve"> tỷ đồng với giá trị HĐ 214 tỷ) và </w:t>
+              <w:t xml:space="preserve"> giá trị HĐ trước thuế (50.078.488.098 đồng) và </w:t>
             </w:r>
             <w:r>
               <w:rPr>
@@ -2866,28 +2736,7 @@
                 <w:sz w:val="24"/>
                 <w:szCs w:val="24"/>
               </w:rPr>
-              <w:t xml:space="preserve"> giá trị HĐ (≈ </w:t>
-            </w:r>
-            <w:r>
-              <w:rPr>
-                <w:rFonts w:ascii="Times New Roman" w:cs="Times New Roman" w:eastAsia="Times New Roman" w:hAnsi="Times New Roman"/>
-                <w:b w:val="false"/>
-                <w:bCs w:val="false"/>
-                <w:sz w:val="24"/>
-                <w:szCs w:val="24"/>
-                <w:highlight w:val="yellow"/>
-              </w:rPr>
-              <w:t xml:space="preserve">32,1</w:t>
-            </w:r>
-            <w:r>
-              <w:rPr>
-                <w:rFonts w:ascii="Times New Roman" w:cs="Times New Roman" w:eastAsia="Times New Roman" w:hAnsi="Times New Roman"/>
-                <w:b w:val="false"/>
-                <w:bCs w:val="false"/>
-                <w:sz w:val="24"/>
-                <w:szCs w:val="24"/>
-              </w:rPr>
-              <w:t xml:space="preserve"> tỷ đồng), phát hành trong 20 ngày kể từ ngày ký, hiệu lực đến khi phê duyệt quyết toán (theo đề nghị của Phục Hưng).</w:t>
+              <w:t xml:space="preserve"> giá trị HĐ (≈ 32,45 tỷ đồng), phát hành trong 20 ngày kể từ ngày ký, hiệu lực đến khi phê duyệt quyết toán (theo đề nghị của Phục Hưng).</w:t>
             </w:r>
           </w:p>
         </w:tc>
@@ -3131,28 +2980,7 @@
           <w:sz w:val="26"/>
           <w:szCs w:val="26"/>
         </w:rPr>
-        <w:t xml:space="preserve">1. Giá trị hợp đồng với Công ty CP Xây dựng Phục Hưng Holdings: </w:t>
-      </w:r>
-      <w:r>
-        <w:rPr>
-          <w:rFonts w:ascii="Times New Roman" w:cs="Times New Roman" w:eastAsia="Times New Roman" w:hAnsi="Times New Roman"/>
-          <w:b w:val="false"/>
-          <w:bCs w:val="false"/>
-          <w:sz w:val="26"/>
-          <w:szCs w:val="26"/>
-          <w:highlight w:val="yellow"/>
-        </w:rPr>
-        <w:t xml:space="preserve">……</w:t>
-      </w:r>
-      <w:r>
-        <w:rPr>
-          <w:rFonts w:ascii="Times New Roman" w:cs="Times New Roman" w:eastAsia="Times New Roman" w:hAnsi="Times New Roman"/>
-          <w:b w:val="false"/>
-          <w:bCs w:val="false"/>
-          <w:sz w:val="26"/>
-          <w:szCs w:val="26"/>
-        </w:rPr>
-        <w:t xml:space="preserve"> đồng (đã gồm VAT 8%), phạm vi không bao gồm công tác đất;</w:t>
+        <w:t xml:space="preserve">1. Giá trị hợp đồng (tạm tính) với Công ty CP Xây dựng Phục Hưng Holdings: 216.339.068.583 đồng (đã gồm VAT 8%; trước VAT 200.313.952.392 đồng), phạm vi không bao gồm công tác đất;</w:t>
       </w:r>
     </w:p>
     <w:p>

</xml_diff>

<commit_message>
Tờ trình: đồng bộ điều kiện thanh toán, thu hồi tạm ứng theo HĐ mới nhất
Co-Authored-By: Claude Opus 5.5 <noreply@anthropic.com>
Claude-Session: https://claude.ai/code/session_013kfHyeUKSX8YviAMfNrZNJ
</commit_message>
<xml_diff>
--- a/3. DỰ THẢO HĐ/20.10.2026 Tờ trình phê duyệt giá trị và điều kiện HĐ phần ngầm - Phục Hưng.docx
+++ b/3. DỰ THẢO HĐ/20.10.2026 Tờ trình phê duyệt giá trị và điều kiện HĐ phần ngầm - Phục Hưng.docx
@@ -1565,7 +1565,7 @@
           <w:sz w:val="26"/>
           <w:szCs w:val="26"/>
         </w:rPr>
-        <w:t xml:space="preserve">, không điều chỉnh theo biến động giá vật tư; thanh toán theo khối lượng thực tế được nghiệm thu. Chi phí chung và chi phí cẩu tháp là trọn gói. Khối lượng bể nước sinh hoạt, PCCC, xử lý nước thải là tạm tính, điều chỉnh khi có thiết kế bản vẽ thi công.</w:t>
+        <w:t xml:space="preserve">, không điều chỉnh theo biến động giá vật tư; thanh toán theo khối lượng thực tế được nghiệm thu. Chi phí chung và chi phí cẩu tháp là trọn gói. Khối lượng bể nước sinh hoạt, PCCC, xử lý nước thải là tạm tính (xem Mục 3).</w:t>
       </w:r>
     </w:p>
     <w:p>
@@ -1874,7 +1874,7 @@
                 <w:sz w:val="24"/>
                 <w:szCs w:val="24"/>
               </w:rPr>
-              <w:t xml:space="preserve">– Thu hồi dần từ đợt thanh toán đầu, thu hết khi khối lượng hoàn thành đạt 80% giá trị HĐ.</w:t>
+              <w:t xml:space="preserve">– Thu hồi dần từ đợt thanh toán đầu theo công thức GTTƯ × GTHT/(GTHĐ × 75%), tức thu hết khi khối lượng hoàn thành đạt 75% giá trị HĐ.</w:t>
             </w:r>
           </w:p>
         </w:tc>
@@ -2080,23 +2080,38 @@
             <w:r>
               <w:rPr>
                 <w:rFonts w:ascii="Times New Roman" w:cs="Times New Roman" w:eastAsia="Times New Roman" w:hAnsi="Times New Roman"/>
-                <w:b w:val="false"/>
-                <w:bCs w:val="false"/>
-                <w:sz w:val="24"/>
-                <w:szCs w:val="24"/>
-                <w:highlight w:val="yellow"/>
-              </w:rPr>
-              <w:t xml:space="preserve">20</w:t>
-            </w:r>
-            <w:r>
-              <w:rPr>
-                <w:rFonts w:ascii="Times New Roman" w:cs="Times New Roman" w:eastAsia="Times New Roman" w:hAnsi="Times New Roman"/>
-                <w:b w:val="false"/>
-                <w:bCs w:val="false"/>
-                <w:sz w:val="24"/>
-                <w:szCs w:val="24"/>
-              </w:rPr>
-              <w:t xml:space="preserve"> ngày kể từ ngày xác nhận.</w:t>
+                <w:b/>
+                <w:bCs/>
+                <w:sz w:val="24"/>
+                <w:szCs w:val="24"/>
+              </w:rPr>
+              <w:t xml:space="preserve">14 ngày</w:t>
+            </w:r>
+            <w:r>
+              <w:rPr>
+                <w:rFonts w:ascii="Times New Roman" w:cs="Times New Roman" w:eastAsia="Times New Roman" w:hAnsi="Times New Roman"/>
+                <w:b w:val="false"/>
+                <w:bCs w:val="false"/>
+                <w:sz w:val="24"/>
+                <w:szCs w:val="24"/>
+              </w:rPr>
+              <w:t xml:space="preserve"> kể từ ngày xác nhận.</w:t>
+            </w:r>
+          </w:p>
+          <w:p>
+            <w:pPr>
+              <w:spacing w:after="20" w:before="0" w:line="250"/>
+              <w:jc w:val="left"/>
+            </w:pPr>
+            <w:r>
+              <w:rPr>
+                <w:rFonts w:ascii="Times New Roman" w:cs="Times New Roman" w:eastAsia="Times New Roman" w:hAnsi="Times New Roman"/>
+                <w:b w:val="false"/>
+                <w:bCs w:val="false"/>
+                <w:sz w:val="24"/>
+                <w:szCs w:val="24"/>
+              </w:rPr>
+              <w:t xml:space="preserve">– Chi phí chung, cẩu tháp (trọn gói) thanh toán theo tỷ lệ giá trị công tác thi công chính hoàn thành.</w:t>
             </w:r>
           </w:p>
           <w:p>
@@ -2146,7 +2161,7 @@
                 <w:sz w:val="24"/>
                 <w:szCs w:val="24"/>
               </w:rPr>
-              <w:t xml:space="preserve">Thời hạn thanh toán: biên bản thương thảo ghi 20 ngày, bản dự thảo gần nhất ghi 14 ngày – đề nghị chốt một con số.</w:t>
+              <w:t xml:space="preserve">Biên bản thương thảo ghi 20 ngày; dự thảo HĐ chốt 14 ngày.</w:t>
             </w:r>
           </w:p>
         </w:tc>
@@ -2272,7 +2287,27 @@
                 <w:sz w:val="24"/>
                 <w:szCs w:val="24"/>
               </w:rPr>
-              <w:t xml:space="preserve"> giá trị quyết toán, giữ lại 5% bảo hành.</w:t>
+              <w:t xml:space="preserve"> giá trị quyết toán trong </w:t>
+            </w:r>
+            <w:r>
+              <w:rPr>
+                <w:rFonts w:ascii="Times New Roman" w:cs="Times New Roman" w:eastAsia="Times New Roman" w:hAnsi="Times New Roman"/>
+                <w:b/>
+                <w:bCs/>
+                <w:sz w:val="24"/>
+                <w:szCs w:val="24"/>
+              </w:rPr>
+              <w:t xml:space="preserve">30 ngày</w:t>
+            </w:r>
+            <w:r>
+              <w:rPr>
+                <w:rFonts w:ascii="Times New Roman" w:cs="Times New Roman" w:eastAsia="Times New Roman" w:hAnsi="Times New Roman"/>
+                <w:b w:val="false"/>
+                <w:bCs w:val="false"/>
+                <w:sz w:val="24"/>
+                <w:szCs w:val="24"/>
+              </w:rPr>
+              <w:t xml:space="preserve"> kể từ ngày Bên A xác nhận quyết toán, giữ lại 5% bảo hành. Giá trị thanh toán cuối cùng là giá trị quyết toán.</w:t>
             </w:r>
           </w:p>
         </w:tc>
@@ -2436,7 +2471,7 @@
                 <w:sz w:val="24"/>
                 <w:szCs w:val="24"/>
               </w:rPr>
-              <w:t xml:space="preserve"> giá trị quyết toán; được thay bằng bảo lãnh bảo hành.</w:t>
+              <w:t xml:space="preserve"> giá trị quyết toán, hoàn trả trong 30 ngày làm việc kể từ khi nhận đủ hồ sơ; được thay bằng bảo lãnh bảo hành.</w:t>
             </w:r>
           </w:p>
           <w:p>
@@ -2932,6 +2967,43 @@
           <w:szCs w:val="26"/>
         </w:rPr>
         <w:t xml:space="preserve">– Tỷ lệ tạm ứng vật tư: chờ Phục Hưng đề xuất.</w:t>
+      </w:r>
+    </w:p>
+    <w:p>
+      <w:pPr>
+        <w:spacing w:after="20" w:before="0" w:line="288"/>
+        <w:ind w:left="200" w:hanging="0"/>
+        <w:jc w:val="both"/>
+      </w:pPr>
+      <w:r>
+        <w:rPr>
+          <w:rFonts w:ascii="Times New Roman" w:cs="Times New Roman" w:eastAsia="Times New Roman" w:hAnsi="Times New Roman"/>
+          <w:b w:val="false"/>
+          <w:bCs w:val="false"/>
+          <w:sz w:val="26"/>
+          <w:szCs w:val="26"/>
+        </w:rPr>
+        <w:t xml:space="preserve">– Bể nước sinh hoạt, PCCC, xử lý nước thải: khối lượng tạm tính; đơn giá chưa bao gồm chi phí biện pháp thi công (cừ, văng, chống thấm…), hai bên thống nhất khi có thiết kế bản vẽ thi công – </w:t>
+      </w:r>
+      <w:r>
+        <w:rPr>
+          <w:rFonts w:ascii="Times New Roman" w:cs="Times New Roman" w:eastAsia="Times New Roman" w:hAnsi="Times New Roman"/>
+          <w:b/>
+          <w:bCs/>
+          <w:sz w:val="26"/>
+          <w:szCs w:val="26"/>
+        </w:rPr>
+        <w:t xml:space="preserve">giá trị hợp đồng có thể tăng</w:t>
+      </w:r>
+      <w:r>
+        <w:rPr>
+          <w:rFonts w:ascii="Times New Roman" w:cs="Times New Roman" w:eastAsia="Times New Roman" w:hAnsi="Times New Roman"/>
+          <w:b w:val="false"/>
+          <w:bCs w:val="false"/>
+          <w:sz w:val="26"/>
+          <w:szCs w:val="26"/>
+        </w:rPr>
+        <w:t xml:space="preserve"> ở phần này.</w:t>
       </w:r>
     </w:p>
     <w:p>

</xml_diff>

<commit_message>
Tờ trình: bảo lãnh thanh toán của Bên A không áp dụng
Co-Authored-By: Claude Opus 5.5 <noreply@anthropic.com>
Claude-Session: https://claude.ai/code/session_013kfHyeUKSX8YviAMfNrZNJ
</commit_message>
<xml_diff>
--- a/3. DỰ THẢO HĐ/20.10.2026 Tờ trình phê duyệt giá trị và điều kiện HĐ phần ngầm - Phục Hưng.docx
+++ b/3. DỰ THẢO HĐ/20.10.2026 Tờ trình phê duyệt giá trị và điều kiện HĐ phần ngầm - Phục Hưng.docx
@@ -1583,15 +1583,15 @@
           <w:color w:themeColor="text1" w:val="000000"/>
           <w:lang w:val="en-US"/>
         </w:rPr>
-        <w:t xml:space="preserve">- Bảo lãnh của VNCN E&amp;C:</w:t>
-      </w:r>
-      <w:r>
-        <w:rPr>
-          <w:rFonts w:cs="Calibri Light" w:ascii="Calibri Light" w:hAnsi="Calibri Light" w:asciiTheme="majorHAnsi" w:cstheme="majorHAnsi" w:hAnsiTheme="majorHAnsi"/>
-          <w:color w:themeColor="text1" w:val="000000"/>
-          <w:lang w:val="en-US"/>
-        </w:rPr>
-        <w:t xml:space="preserve"> bảo lãnh thanh toán 15% giá trị hợp đồng (≈ 32,45 tỷ đồng) theo đề nghị của Phục Hưng – nghĩa vụ tài chính lớn, kính đề nghị Lãnh đạo cho ý kiến.</w:t>
+        <w:t xml:space="preserve">- Bảo lãnh thanh toán của VNCN E&amp;C:</w:t>
+      </w:r>
+      <w:r>
+        <w:rPr>
+          <w:rFonts w:cs="Calibri Light" w:ascii="Calibri Light" w:hAnsi="Calibri Light" w:asciiTheme="majorHAnsi" w:cstheme="majorHAnsi" w:hAnsiTheme="majorHAnsi"/>
+          <w:color w:themeColor="text1" w:val="000000"/>
+          <w:lang w:val="en-US"/>
+        </w:rPr>
+        <w:t xml:space="preserve"> không áp dụng (Phục Hưng đề nghị bảo lãnh 15% giá trị hợp đồng, BCH đề xuất không chấp thuận).</w:t>
       </w:r>
     </w:p>
     <w:p>

</xml_diff>

<commit_message>
Tờ trình: trình bày giá trị, điều kiện HĐ dạng bảng
Co-Authored-By: Claude Opus 5.5 <noreply@anthropic.com>
Claude-Session: https://claude.ai/code/session_013kfHyeUKSX8YviAMfNrZNJ
</commit_message>
<xml_diff>
--- a/3. DỰ THẢO HĐ/20.10.2026 Tờ trình phê duyệt giá trị và điều kiện HĐ phần ngầm - Phục Hưng.docx
+++ b/3. DỰ THẢO HĐ/20.10.2026 Tờ trình phê duyệt giá trị và điều kiện HĐ phần ngầm - Phục Hưng.docx
@@ -999,142 +999,723 @@
         <w:t xml:space="preserve"> thi công hệ cừ, văng chống; kết cấu BTCT phần ngầm đến cốt ±0.00; bể nước; móng cẩu tháp; chống thấm phần ngầm khối CT1.2 và CT2. Cắt khỏi phạm vi của Phục Hưng: công tác đất (đào, vận chuyển, đắp, đập đầu cọc, san gạt nền) đã giao Hoàng Minh theo Tờ trình 29092026-01; công tác chống mối; cọc khoan nhồi, phá dỡ móng cẩu tháp.</w:t>
       </w:r>
     </w:p>
-    <w:p>
-      <w:pPr>
-        <w:pStyle w:val="ListParagraph"/>
-        <w:numPr>
-          <w:ilvl w:val="0"/>
-          <w:numId w:val="0"/>
-        </w:numPr>
-        <w:spacing w:before="0" w:after="120"/>
-        <w:ind w:hanging="0" w:left="0"/>
-        <w:contextualSpacing w:val="false"/>
-        <w:rPr>
-          <w:rFonts w:ascii="Calibri Light" w:hAnsi="Calibri Light" w:cs="Calibri Light" w:asciiTheme="majorHAnsi" w:cstheme="majorHAnsi" w:hAnsiTheme="majorHAnsi"/>
-          <w:color w:themeColor="text1" w:val="000000"/>
-          <w:lang w:val="en-US"/>
-        </w:rPr>
-      </w:pPr>
-      <w:r>
-        <w:rPr>
-          <w:rFonts w:cs="Calibri Light" w:ascii="Calibri Light" w:hAnsi="Calibri Light" w:asciiTheme="majorHAnsi" w:cstheme="majorHAnsi" w:hAnsiTheme="majorHAnsi"/>
-          <w:b/>
-          <w:color w:themeColor="text1" w:val="000000"/>
-          <w:lang w:val="en-US"/>
-        </w:rPr>
-        <w:t xml:space="preserve">- Giá trúng thầu theo LOA (gồm công tác đất):</w:t>
-      </w:r>
-      <w:r>
-        <w:rPr>
-          <w:rFonts w:cs="Calibri Light" w:ascii="Calibri Light" w:hAnsi="Calibri Light" w:asciiTheme="majorHAnsi" w:cstheme="majorHAnsi" w:hAnsiTheme="majorHAnsi"/>
-          <w:color w:themeColor="text1" w:val="000000"/>
-          <w:lang w:val="en-US"/>
-        </w:rPr>
-        <w:t xml:space="preserve"> 214.000.000.000 đồng (chưa VAT).</w:t>
-      </w:r>
-    </w:p>
-    <w:p>
-      <w:pPr>
-        <w:pStyle w:val="ListParagraph"/>
-        <w:numPr>
-          <w:ilvl w:val="0"/>
-          <w:numId w:val="0"/>
-        </w:numPr>
-        <w:spacing w:before="0" w:after="120"/>
-        <w:ind w:hanging="0" w:left="0"/>
-        <w:contextualSpacing w:val="false"/>
-        <w:rPr>
-          <w:rFonts w:ascii="Calibri Light" w:hAnsi="Calibri Light" w:cs="Calibri Light" w:asciiTheme="majorHAnsi" w:cstheme="majorHAnsi" w:hAnsiTheme="majorHAnsi"/>
-          <w:color w:themeColor="text1" w:val="000000"/>
-          <w:lang w:val="en-US"/>
-        </w:rPr>
-      </w:pPr>
-      <w:r>
-        <w:rPr>
-          <w:rFonts w:cs="Calibri Light" w:ascii="Calibri Light" w:hAnsi="Calibri Light" w:asciiTheme="majorHAnsi" w:cstheme="majorHAnsi" w:hAnsiTheme="majorHAnsi"/>
-          <w:b/>
-          <w:color w:themeColor="text1" w:val="000000"/>
-          <w:lang w:val="en-US"/>
-        </w:rPr>
-        <w:t xml:space="preserve">- Giá trị hợp đồng mới (tạm tính):</w:t>
-      </w:r>
-      <w:r>
-        <w:rPr>
-          <w:rFonts w:cs="Calibri Light" w:ascii="Calibri Light" w:hAnsi="Calibri Light" w:asciiTheme="majorHAnsi" w:cstheme="majorHAnsi" w:hAnsiTheme="majorHAnsi"/>
-          <w:color w:themeColor="text1" w:val="000000"/>
-          <w:lang w:val="en-US"/>
-        </w:rPr>
-        <w:t xml:space="preserve"> 200.313.952.392 đồng chưa VAT; 216.339.068.583 đồng đã gồm VAT 8%.</w:t>
-      </w:r>
-    </w:p>
-    <w:p>
-      <w:pPr>
-        <w:pStyle w:val="ListParagraph"/>
-        <w:numPr>
-          <w:ilvl w:val="0"/>
-          <w:numId w:val="0"/>
-        </w:numPr>
-        <w:spacing w:before="0" w:after="120"/>
-        <w:ind w:hanging="0" w:left="0"/>
-        <w:contextualSpacing w:val="false"/>
-        <w:rPr>
-          <w:rFonts w:ascii="Calibri Light" w:hAnsi="Calibri Light" w:cs="Calibri Light" w:asciiTheme="majorHAnsi" w:cstheme="majorHAnsi" w:hAnsiTheme="majorHAnsi"/>
-          <w:color w:themeColor="text1" w:val="000000"/>
-          <w:lang w:val="en-US"/>
-        </w:rPr>
-      </w:pPr>
-      <w:r>
-        <w:rPr>
-          <w:rFonts w:cs="Calibri Light" w:ascii="Calibri Light" w:hAnsi="Calibri Light" w:asciiTheme="majorHAnsi" w:cstheme="majorHAnsi" w:hAnsiTheme="majorHAnsi"/>
-          <w:b/>
-          <w:color w:themeColor="text1" w:val="000000"/>
-          <w:lang w:val="en-US"/>
-        </w:rPr>
-        <w:t xml:space="preserve">- Chênh lệch:</w:t>
-      </w:r>
-      <w:r>
-        <w:rPr>
-          <w:rFonts w:cs="Calibri Light" w:ascii="Calibri Light" w:hAnsi="Calibri Light" w:asciiTheme="majorHAnsi" w:cstheme="majorHAnsi" w:hAnsiTheme="majorHAnsi"/>
-          <w:color w:themeColor="text1" w:val="000000"/>
-          <w:lang w:val="en-US"/>
-        </w:rPr>
-        <w:t xml:space="preserve"> giảm 13.686.047.608 đồng, tương đương 6,40% so với giá trúng thầu tại LOA; so với dự toán (</w:t>
-      </w:r>
-      <w:r>
-        <w:rPr>
-          <w:rFonts w:cs="Calibri Light" w:ascii="Calibri Light" w:hAnsi="Calibri Light" w:asciiTheme="majorHAnsi" w:cstheme="majorHAnsi" w:hAnsiTheme="majorHAnsi"/>
-          <w:color w:themeColor="text1" w:val="000000"/>
-          <w:lang w:val="en-US"/>
-          <w:highlight w:val="yellow"/>
-        </w:rPr>
-        <w:t xml:space="preserve">……</w:t>
-      </w:r>
-      <w:r>
-        <w:rPr>
-          <w:rFonts w:cs="Calibri Light" w:ascii="Calibri Light" w:hAnsi="Calibri Light" w:asciiTheme="majorHAnsi" w:cstheme="majorHAnsi" w:hAnsiTheme="majorHAnsi"/>
-          <w:color w:themeColor="text1" w:val="000000"/>
-          <w:lang w:val="en-US"/>
-        </w:rPr>
-        <w:t xml:space="preserve"> đồng) giảm </w:t>
-      </w:r>
-      <w:r>
-        <w:rPr>
-          <w:rFonts w:cs="Calibri Light" w:ascii="Calibri Light" w:hAnsi="Calibri Light" w:asciiTheme="majorHAnsi" w:cstheme="majorHAnsi" w:hAnsiTheme="majorHAnsi"/>
-          <w:color w:themeColor="text1" w:val="000000"/>
-          <w:lang w:val="en-US"/>
-          <w:highlight w:val="yellow"/>
-        </w:rPr>
-        <w:t xml:space="preserve">……</w:t>
-      </w:r>
-      <w:r>
-        <w:rPr>
-          <w:rFonts w:cs="Calibri Light" w:ascii="Calibri Light" w:hAnsi="Calibri Light" w:asciiTheme="majorHAnsi" w:cstheme="majorHAnsi" w:hAnsiTheme="majorHAnsi"/>
-          <w:color w:themeColor="text1" w:val="000000"/>
-          <w:lang w:val="en-US"/>
-        </w:rPr>
-        <w:t xml:space="preserve">%.</w:t>
-      </w:r>
-    </w:p>
+    <w:tbl>
+      <w:tblPr>
+        <w:tblW w:w="8888" w:type="dxa"/>
+        <w:tblInd w:w="198" w:type="dxa"/>
+        <w:tblBorders>
+          <w:top w:val="single" w:sz="4" w:space="0" w:color="000000"/>
+          <w:left w:val="single" w:sz="4" w:space="0" w:color="000000"/>
+          <w:bottom w:val="single" w:sz="4" w:space="0" w:color="000000"/>
+          <w:right w:val="single" w:sz="4" w:space="0" w:color="000000"/>
+          <w:insideH w:val="single" w:sz="4" w:space="0" w:color="000000"/>
+          <w:insideV w:val="single" w:sz="4" w:space="0" w:color="000000"/>
+        </w:tblBorders>
+        <w:tblLayout w:type="fixed"/>
+        <w:tblCellMar>
+          <w:left w:w="85" w:type="dxa"/>
+          <w:right w:w="85" w:type="dxa"/>
+        </w:tblCellMar>
+      </w:tblPr>
+      <w:tblGrid>
+        <w:gridCol w:w="600"/>
+        <w:gridCol w:w="3888"/>
+        <w:gridCol w:w="2100"/>
+        <w:gridCol w:w="2300"/>
+      </w:tblGrid>
+      <w:tr>
+        <w:trPr>
+          <w:cantSplit/>
+          <w:tblHeader/>
+        </w:trPr>
+        <w:tc>
+          <w:tcPr>
+            <w:tcW w:w="600" w:type="dxa"/>
+            <w:shd w:val="clear" w:color="auto" w:fill="D9D9D9"/>
+            <w:vAlign w:val="center"/>
+          </w:tcPr>
+          <w:p>
+            <w:pPr>
+              <w:spacing w:before="20" w:after="20" w:line="252" w:lineRule="auto"/>
+              <w:ind w:left="0" w:right="0" w:firstLine="0"/>
+              <w:jc w:val="center"/>
+            </w:pPr>
+            <w:r>
+              <w:rPr>
+                <w:rFonts w:cs="Calibri Light" w:ascii="Calibri Light" w:hAnsi="Calibri Light" w:asciiTheme="majorHAnsi" w:cstheme="majorHAnsi" w:hAnsiTheme="majorHAnsi"/>
+                <w:b/>
+                <w:color w:themeColor="text1" w:val="000000"/>
+                <w:lang w:val="en-US"/>
+                <w:sz w:val="22"/>
+                <w:szCs w:val="22"/>
+              </w:rPr>
+              <w:t xml:space="preserve">TT</w:t>
+            </w:r>
+          </w:p>
+        </w:tc>
+        <w:tc>
+          <w:tcPr>
+            <w:tcW w:w="3888" w:type="dxa"/>
+            <w:shd w:val="clear" w:color="auto" w:fill="D9D9D9"/>
+            <w:vAlign w:val="center"/>
+          </w:tcPr>
+          <w:p>
+            <w:pPr>
+              <w:spacing w:before="20" w:after="20" w:line="252" w:lineRule="auto"/>
+              <w:ind w:left="0" w:right="0" w:firstLine="0"/>
+              <w:jc w:val="center"/>
+            </w:pPr>
+            <w:r>
+              <w:rPr>
+                <w:rFonts w:cs="Calibri Light" w:ascii="Calibri Light" w:hAnsi="Calibri Light" w:asciiTheme="majorHAnsi" w:cstheme="majorHAnsi" w:hAnsiTheme="majorHAnsi"/>
+                <w:b/>
+                <w:color w:themeColor="text1" w:val="000000"/>
+                <w:lang w:val="en-US"/>
+                <w:sz w:val="22"/>
+                <w:szCs w:val="22"/>
+              </w:rPr>
+              <w:t xml:space="preserve">Nội dung</w:t>
+            </w:r>
+          </w:p>
+        </w:tc>
+        <w:tc>
+          <w:tcPr>
+            <w:tcW w:w="2100" w:type="dxa"/>
+            <w:shd w:val="clear" w:color="auto" w:fill="D9D9D9"/>
+            <w:vAlign w:val="center"/>
+          </w:tcPr>
+          <w:p>
+            <w:pPr>
+              <w:spacing w:before="20" w:after="20" w:line="252" w:lineRule="auto"/>
+              <w:ind w:left="0" w:right="0" w:firstLine="0"/>
+              <w:jc w:val="center"/>
+            </w:pPr>
+            <w:r>
+              <w:rPr>
+                <w:rFonts w:cs="Calibri Light" w:ascii="Calibri Light" w:hAnsi="Calibri Light" w:asciiTheme="majorHAnsi" w:cstheme="majorHAnsi" w:hAnsiTheme="majorHAnsi"/>
+                <w:b/>
+                <w:color w:themeColor="text1" w:val="000000"/>
+                <w:lang w:val="en-US"/>
+                <w:sz w:val="22"/>
+                <w:szCs w:val="22"/>
+              </w:rPr>
+              <w:t xml:space="preserve">Giá trị (đồng)</w:t>
+            </w:r>
+          </w:p>
+        </w:tc>
+        <w:tc>
+          <w:tcPr>
+            <w:tcW w:w="2300" w:type="dxa"/>
+            <w:shd w:val="clear" w:color="auto" w:fill="D9D9D9"/>
+            <w:vAlign w:val="center"/>
+          </w:tcPr>
+          <w:p>
+            <w:pPr>
+              <w:spacing w:before="20" w:after="20" w:line="252" w:lineRule="auto"/>
+              <w:ind w:left="0" w:right="0" w:firstLine="0"/>
+              <w:jc w:val="center"/>
+            </w:pPr>
+            <w:r>
+              <w:rPr>
+                <w:rFonts w:cs="Calibri Light" w:ascii="Calibri Light" w:hAnsi="Calibri Light" w:asciiTheme="majorHAnsi" w:cstheme="majorHAnsi" w:hAnsiTheme="majorHAnsi"/>
+                <w:b/>
+                <w:color w:themeColor="text1" w:val="000000"/>
+                <w:lang w:val="en-US"/>
+                <w:sz w:val="22"/>
+                <w:szCs w:val="22"/>
+              </w:rPr>
+              <w:t xml:space="preserve">Ghi chú</w:t>
+            </w:r>
+          </w:p>
+        </w:tc>
+      </w:tr>
+      <w:tr>
+        <w:trPr>
+          <w:cantSplit/>
+        </w:trPr>
+        <w:tc>
+          <w:tcPr>
+            <w:tcW w:w="600" w:type="dxa"/>
+            <w:vAlign w:val="center"/>
+          </w:tcPr>
+          <w:p>
+            <w:pPr>
+              <w:spacing w:before="20" w:after="20" w:line="252" w:lineRule="auto"/>
+              <w:ind w:left="0" w:right="0" w:firstLine="0"/>
+              <w:jc w:val="center"/>
+            </w:pPr>
+            <w:r>
+              <w:rPr>
+                <w:rFonts w:cs="Calibri Light" w:ascii="Calibri Light" w:hAnsi="Calibri Light" w:asciiTheme="majorHAnsi" w:cstheme="majorHAnsi" w:hAnsiTheme="majorHAnsi"/>
+                <w:color w:themeColor="text1" w:val="000000"/>
+                <w:lang w:val="en-US"/>
+                <w:sz w:val="22"/>
+                <w:szCs w:val="22"/>
+              </w:rPr>
+              <w:t xml:space="preserve">1</w:t>
+            </w:r>
+          </w:p>
+        </w:tc>
+        <w:tc>
+          <w:tcPr>
+            <w:tcW w:w="3888" w:type="dxa"/>
+            <w:vAlign w:val="center"/>
+          </w:tcPr>
+          <w:p>
+            <w:pPr>
+              <w:spacing w:before="20" w:after="20" w:line="252" w:lineRule="auto"/>
+              <w:ind w:left="0" w:right="0" w:firstLine="0"/>
+              <w:jc w:val="left"/>
+            </w:pPr>
+            <w:r>
+              <w:rPr>
+                <w:rFonts w:cs="Calibri Light" w:ascii="Calibri Light" w:hAnsi="Calibri Light" w:asciiTheme="majorHAnsi" w:cstheme="majorHAnsi" w:hAnsiTheme="majorHAnsi"/>
+                <w:color w:themeColor="text1" w:val="000000"/>
+                <w:lang w:val="en-US"/>
+                <w:sz w:val="22"/>
+                <w:szCs w:val="22"/>
+              </w:rPr>
+              <w:t xml:space="preserve">Giá trúng thầu theo LOA (gồm công tác đất)</w:t>
+            </w:r>
+          </w:p>
+        </w:tc>
+        <w:tc>
+          <w:tcPr>
+            <w:tcW w:w="2100" w:type="dxa"/>
+            <w:vAlign w:val="center"/>
+          </w:tcPr>
+          <w:p>
+            <w:pPr>
+              <w:spacing w:before="20" w:after="20" w:line="252" w:lineRule="auto"/>
+              <w:ind w:left="0" w:right="0" w:firstLine="0"/>
+              <w:jc w:val="right"/>
+            </w:pPr>
+            <w:r>
+              <w:rPr>
+                <w:rFonts w:cs="Calibri Light" w:ascii="Calibri Light" w:hAnsi="Calibri Light" w:asciiTheme="majorHAnsi" w:cstheme="majorHAnsi" w:hAnsiTheme="majorHAnsi"/>
+                <w:color w:themeColor="text1" w:val="000000"/>
+                <w:lang w:val="en-US"/>
+                <w:sz w:val="22"/>
+                <w:szCs w:val="22"/>
+              </w:rPr>
+              <w:t xml:space="preserve">214.000.000.000</w:t>
+            </w:r>
+          </w:p>
+        </w:tc>
+        <w:tc>
+          <w:tcPr>
+            <w:tcW w:w="2300" w:type="dxa"/>
+            <w:vAlign w:val="center"/>
+          </w:tcPr>
+          <w:p>
+            <w:pPr>
+              <w:spacing w:before="20" w:after="20" w:line="252" w:lineRule="auto"/>
+              <w:ind w:left="0" w:right="0" w:firstLine="0"/>
+              <w:jc w:val="left"/>
+            </w:pPr>
+            <w:r>
+              <w:rPr>
+                <w:rFonts w:cs="Calibri Light" w:ascii="Calibri Light" w:hAnsi="Calibri Light" w:asciiTheme="majorHAnsi" w:cstheme="majorHAnsi" w:hAnsiTheme="majorHAnsi"/>
+                <w:color w:themeColor="text1" w:val="000000"/>
+                <w:lang w:val="en-US"/>
+                <w:sz w:val="22"/>
+                <w:szCs w:val="22"/>
+              </w:rPr>
+              <w:t xml:space="preserve">Chưa VAT</w:t>
+            </w:r>
+          </w:p>
+        </w:tc>
+      </w:tr>
+      <w:tr>
+        <w:trPr>
+          <w:cantSplit/>
+        </w:trPr>
+        <w:tc>
+          <w:tcPr>
+            <w:tcW w:w="600" w:type="dxa"/>
+            <w:vAlign w:val="center"/>
+          </w:tcPr>
+          <w:p>
+            <w:pPr>
+              <w:spacing w:before="20" w:after="20" w:line="252" w:lineRule="auto"/>
+              <w:ind w:left="0" w:right="0" w:firstLine="0"/>
+              <w:jc w:val="center"/>
+            </w:pPr>
+            <w:r>
+              <w:rPr>
+                <w:rFonts w:cs="Calibri Light" w:ascii="Calibri Light" w:hAnsi="Calibri Light" w:asciiTheme="majorHAnsi" w:cstheme="majorHAnsi" w:hAnsiTheme="majorHAnsi"/>
+                <w:color w:themeColor="text1" w:val="000000"/>
+                <w:lang w:val="en-US"/>
+                <w:sz w:val="22"/>
+                <w:szCs w:val="22"/>
+              </w:rPr>
+              <w:t xml:space="preserve">2</w:t>
+            </w:r>
+          </w:p>
+        </w:tc>
+        <w:tc>
+          <w:tcPr>
+            <w:tcW w:w="3888" w:type="dxa"/>
+            <w:vAlign w:val="center"/>
+          </w:tcPr>
+          <w:p>
+            <w:pPr>
+              <w:spacing w:before="20" w:after="20" w:line="252" w:lineRule="auto"/>
+              <w:ind w:left="0" w:right="0" w:firstLine="0"/>
+              <w:jc w:val="left"/>
+            </w:pPr>
+            <w:r>
+              <w:rPr>
+                <w:rFonts w:cs="Calibri Light" w:ascii="Calibri Light" w:hAnsi="Calibri Light" w:asciiTheme="majorHAnsi" w:cstheme="majorHAnsi" w:hAnsiTheme="majorHAnsi"/>
+                <w:color w:themeColor="text1" w:val="000000"/>
+                <w:lang w:val="en-US"/>
+                <w:sz w:val="22"/>
+                <w:szCs w:val="22"/>
+              </w:rPr>
+              <w:t xml:space="preserve">Giá trị hợp đồng mới – trước VAT</w:t>
+            </w:r>
+          </w:p>
+        </w:tc>
+        <w:tc>
+          <w:tcPr>
+            <w:tcW w:w="2100" w:type="dxa"/>
+            <w:vAlign w:val="center"/>
+          </w:tcPr>
+          <w:p>
+            <w:pPr>
+              <w:spacing w:before="20" w:after="20" w:line="252" w:lineRule="auto"/>
+              <w:ind w:left="0" w:right="0" w:firstLine="0"/>
+              <w:jc w:val="right"/>
+            </w:pPr>
+            <w:r>
+              <w:rPr>
+                <w:rFonts w:cs="Calibri Light" w:ascii="Calibri Light" w:hAnsi="Calibri Light" w:asciiTheme="majorHAnsi" w:cstheme="majorHAnsi" w:hAnsiTheme="majorHAnsi"/>
+                <w:color w:themeColor="text1" w:val="000000"/>
+                <w:lang w:val="en-US"/>
+                <w:sz w:val="22"/>
+                <w:szCs w:val="22"/>
+              </w:rPr>
+              <w:t xml:space="preserve">200.313.952.392</w:t>
+            </w:r>
+          </w:p>
+        </w:tc>
+        <w:tc>
+          <w:tcPr>
+            <w:tcW w:w="2300" w:type="dxa"/>
+            <w:vAlign w:val="center"/>
+          </w:tcPr>
+          <w:p>
+            <w:pPr>
+              <w:spacing w:before="20" w:after="20" w:line="252" w:lineRule="auto"/>
+              <w:ind w:left="0" w:right="0" w:firstLine="0"/>
+              <w:jc w:val="left"/>
+            </w:pPr>
+            <w:r>
+              <w:rPr>
+                <w:rFonts w:cs="Calibri Light" w:ascii="Calibri Light" w:hAnsi="Calibri Light" w:asciiTheme="majorHAnsi" w:cstheme="majorHAnsi" w:hAnsiTheme="majorHAnsi"/>
+                <w:color w:themeColor="text1" w:val="000000"/>
+                <w:lang w:val="en-US"/>
+                <w:sz w:val="22"/>
+                <w:szCs w:val="22"/>
+              </w:rPr>
+              <w:t xml:space="preserve">Đã bỏ công tác đất</w:t>
+            </w:r>
+          </w:p>
+        </w:tc>
+      </w:tr>
+      <w:tr>
+        <w:trPr>
+          <w:cantSplit/>
+        </w:trPr>
+        <w:tc>
+          <w:tcPr>
+            <w:tcW w:w="600" w:type="dxa"/>
+            <w:vAlign w:val="center"/>
+          </w:tcPr>
+          <w:p>
+            <w:pPr>
+              <w:spacing w:before="20" w:after="20" w:line="252" w:lineRule="auto"/>
+              <w:ind w:left="0" w:right="0" w:firstLine="0"/>
+              <w:jc w:val="center"/>
+            </w:pPr>
+            <w:r>
+              <w:rPr>
+                <w:rFonts w:cs="Calibri Light" w:ascii="Calibri Light" w:hAnsi="Calibri Light" w:asciiTheme="majorHAnsi" w:cstheme="majorHAnsi" w:hAnsiTheme="majorHAnsi"/>
+                <w:color w:themeColor="text1" w:val="000000"/>
+                <w:lang w:val="en-US"/>
+                <w:sz w:val="22"/>
+                <w:szCs w:val="22"/>
+              </w:rPr>
+              <w:t xml:space="preserve">3</w:t>
+            </w:r>
+          </w:p>
+        </w:tc>
+        <w:tc>
+          <w:tcPr>
+            <w:tcW w:w="3888" w:type="dxa"/>
+            <w:vAlign w:val="center"/>
+          </w:tcPr>
+          <w:p>
+            <w:pPr>
+              <w:spacing w:before="20" w:after="20" w:line="252" w:lineRule="auto"/>
+              <w:ind w:left="0" w:right="0" w:firstLine="0"/>
+              <w:jc w:val="left"/>
+            </w:pPr>
+            <w:r>
+              <w:rPr>
+                <w:rFonts w:cs="Calibri Light" w:ascii="Calibri Light" w:hAnsi="Calibri Light" w:asciiTheme="majorHAnsi" w:cstheme="majorHAnsi" w:hAnsiTheme="majorHAnsi"/>
+                <w:color w:themeColor="text1" w:val="000000"/>
+                <w:lang w:val="en-US"/>
+                <w:sz w:val="22"/>
+                <w:szCs w:val="22"/>
+              </w:rPr>
+              <w:t xml:space="preserve">Thuế GTGT 8%</w:t>
+            </w:r>
+          </w:p>
+        </w:tc>
+        <w:tc>
+          <w:tcPr>
+            <w:tcW w:w="2100" w:type="dxa"/>
+            <w:vAlign w:val="center"/>
+          </w:tcPr>
+          <w:p>
+            <w:pPr>
+              <w:spacing w:before="20" w:after="20" w:line="252" w:lineRule="auto"/>
+              <w:ind w:left="0" w:right="0" w:firstLine="0"/>
+              <w:jc w:val="right"/>
+            </w:pPr>
+            <w:r>
+              <w:rPr>
+                <w:rFonts w:cs="Calibri Light" w:ascii="Calibri Light" w:hAnsi="Calibri Light" w:asciiTheme="majorHAnsi" w:cstheme="majorHAnsi" w:hAnsiTheme="majorHAnsi"/>
+                <w:color w:themeColor="text1" w:val="000000"/>
+                <w:lang w:val="en-US"/>
+                <w:sz w:val="22"/>
+                <w:szCs w:val="22"/>
+              </w:rPr>
+              <w:t xml:space="preserve">16.025.116.191</w:t>
+            </w:r>
+          </w:p>
+        </w:tc>
+        <w:tc>
+          <w:tcPr>
+            <w:tcW w:w="2300" w:type="dxa"/>
+            <w:vAlign w:val="center"/>
+          </w:tcPr>
+          <w:p>
+            <w:pPr>
+              <w:spacing w:before="20" w:after="20" w:line="252" w:lineRule="auto"/>
+              <w:ind w:left="0" w:right="0" w:firstLine="0"/>
+              <w:jc w:val="left"/>
+            </w:pPr>
+          </w:p>
+        </w:tc>
+      </w:tr>
+      <w:tr>
+        <w:trPr>
+          <w:cantSplit/>
+        </w:trPr>
+        <w:tc>
+          <w:tcPr>
+            <w:tcW w:w="600" w:type="dxa"/>
+            <w:vAlign w:val="center"/>
+          </w:tcPr>
+          <w:p>
+            <w:pPr>
+              <w:spacing w:before="20" w:after="20" w:line="252" w:lineRule="auto"/>
+              <w:ind w:left="0" w:right="0" w:firstLine="0"/>
+              <w:jc w:val="center"/>
+            </w:pPr>
+            <w:r>
+              <w:rPr>
+                <w:rFonts w:cs="Calibri Light" w:ascii="Calibri Light" w:hAnsi="Calibri Light" w:asciiTheme="majorHAnsi" w:cstheme="majorHAnsi" w:hAnsiTheme="majorHAnsi"/>
+                <w:color w:themeColor="text1" w:val="000000"/>
+                <w:lang w:val="en-US"/>
+                <w:sz w:val="22"/>
+                <w:szCs w:val="22"/>
+              </w:rPr>
+              <w:t xml:space="preserve">4</w:t>
+            </w:r>
+          </w:p>
+        </w:tc>
+        <w:tc>
+          <w:tcPr>
+            <w:tcW w:w="3888" w:type="dxa"/>
+            <w:vAlign w:val="center"/>
+          </w:tcPr>
+          <w:p>
+            <w:pPr>
+              <w:spacing w:before="20" w:after="20" w:line="252" w:lineRule="auto"/>
+              <w:ind w:left="0" w:right="0" w:firstLine="0"/>
+              <w:jc w:val="left"/>
+            </w:pPr>
+            <w:r>
+              <w:rPr>
+                <w:rFonts w:cs="Calibri Light" w:ascii="Calibri Light" w:hAnsi="Calibri Light" w:asciiTheme="majorHAnsi" w:cstheme="majorHAnsi" w:hAnsiTheme="majorHAnsi"/>
+                <w:b/>
+                <w:color w:themeColor="text1" w:val="000000"/>
+                <w:lang w:val="en-US"/>
+                <w:sz w:val="22"/>
+                <w:szCs w:val="22"/>
+              </w:rPr>
+              <w:t xml:space="preserve">Giá trị hợp đồng mới – sau VAT (tạm tính)</w:t>
+            </w:r>
+          </w:p>
+        </w:tc>
+        <w:tc>
+          <w:tcPr>
+            <w:tcW w:w="2100" w:type="dxa"/>
+            <w:vAlign w:val="center"/>
+          </w:tcPr>
+          <w:p>
+            <w:pPr>
+              <w:spacing w:before="20" w:after="20" w:line="252" w:lineRule="auto"/>
+              <w:ind w:left="0" w:right="0" w:firstLine="0"/>
+              <w:jc w:val="right"/>
+            </w:pPr>
+            <w:r>
+              <w:rPr>
+                <w:rFonts w:cs="Calibri Light" w:ascii="Calibri Light" w:hAnsi="Calibri Light" w:asciiTheme="majorHAnsi" w:cstheme="majorHAnsi" w:hAnsiTheme="majorHAnsi"/>
+                <w:b/>
+                <w:color w:themeColor="text1" w:val="000000"/>
+                <w:lang w:val="en-US"/>
+                <w:sz w:val="22"/>
+                <w:szCs w:val="22"/>
+              </w:rPr>
+              <w:t xml:space="preserve">216.339.068.583</w:t>
+            </w:r>
+          </w:p>
+        </w:tc>
+        <w:tc>
+          <w:tcPr>
+            <w:tcW w:w="2300" w:type="dxa"/>
+            <w:vAlign w:val="center"/>
+          </w:tcPr>
+          <w:p>
+            <w:pPr>
+              <w:spacing w:before="20" w:after="20" w:line="252" w:lineRule="auto"/>
+              <w:ind w:left="0" w:right="0" w:firstLine="0"/>
+              <w:jc w:val="left"/>
+            </w:pPr>
+          </w:p>
+        </w:tc>
+      </w:tr>
+      <w:tr>
+        <w:trPr>
+          <w:cantSplit/>
+        </w:trPr>
+        <w:tc>
+          <w:tcPr>
+            <w:tcW w:w="600" w:type="dxa"/>
+            <w:vAlign w:val="center"/>
+          </w:tcPr>
+          <w:p>
+            <w:pPr>
+              <w:spacing w:before="20" w:after="20" w:line="252" w:lineRule="auto"/>
+              <w:ind w:left="0" w:right="0" w:firstLine="0"/>
+              <w:jc w:val="center"/>
+            </w:pPr>
+            <w:r>
+              <w:rPr>
+                <w:rFonts w:cs="Calibri Light" w:ascii="Calibri Light" w:hAnsi="Calibri Light" w:asciiTheme="majorHAnsi" w:cstheme="majorHAnsi" w:hAnsiTheme="majorHAnsi"/>
+                <w:color w:themeColor="text1" w:val="000000"/>
+                <w:lang w:val="en-US"/>
+                <w:sz w:val="22"/>
+                <w:szCs w:val="22"/>
+              </w:rPr>
+              <w:t xml:space="preserve">5</w:t>
+            </w:r>
+          </w:p>
+        </w:tc>
+        <w:tc>
+          <w:tcPr>
+            <w:tcW w:w="3888" w:type="dxa"/>
+            <w:vAlign w:val="center"/>
+          </w:tcPr>
+          <w:p>
+            <w:pPr>
+              <w:spacing w:before="20" w:after="20" w:line="252" w:lineRule="auto"/>
+              <w:ind w:left="0" w:right="0" w:firstLine="0"/>
+              <w:jc w:val="left"/>
+            </w:pPr>
+            <w:r>
+              <w:rPr>
+                <w:rFonts w:cs="Calibri Light" w:ascii="Calibri Light" w:hAnsi="Calibri Light" w:asciiTheme="majorHAnsi" w:cstheme="majorHAnsi" w:hAnsiTheme="majorHAnsi"/>
+                <w:color w:themeColor="text1" w:val="000000"/>
+                <w:lang w:val="en-US"/>
+                <w:sz w:val="22"/>
+                <w:szCs w:val="22"/>
+              </w:rPr>
+              <w:t xml:space="preserve">Chênh lệch so với LOA (1 − 2)</w:t>
+            </w:r>
+          </w:p>
+        </w:tc>
+        <w:tc>
+          <w:tcPr>
+            <w:tcW w:w="2100" w:type="dxa"/>
+            <w:vAlign w:val="center"/>
+          </w:tcPr>
+          <w:p>
+            <w:pPr>
+              <w:spacing w:before="20" w:after="20" w:line="252" w:lineRule="auto"/>
+              <w:ind w:left="0" w:right="0" w:firstLine="0"/>
+              <w:jc w:val="right"/>
+            </w:pPr>
+            <w:r>
+              <w:rPr>
+                <w:rFonts w:cs="Calibri Light" w:ascii="Calibri Light" w:hAnsi="Calibri Light" w:asciiTheme="majorHAnsi" w:cstheme="majorHAnsi" w:hAnsiTheme="majorHAnsi"/>
+                <w:color w:themeColor="text1" w:val="000000"/>
+                <w:lang w:val="en-US"/>
+                <w:sz w:val="22"/>
+                <w:szCs w:val="22"/>
+              </w:rPr>
+              <w:t xml:space="preserve">13.686.047.608</w:t>
+            </w:r>
+          </w:p>
+        </w:tc>
+        <w:tc>
+          <w:tcPr>
+            <w:tcW w:w="2300" w:type="dxa"/>
+            <w:vAlign w:val="center"/>
+          </w:tcPr>
+          <w:p>
+            <w:pPr>
+              <w:spacing w:before="20" w:after="20" w:line="252" w:lineRule="auto"/>
+              <w:ind w:left="0" w:right="0" w:firstLine="0"/>
+              <w:jc w:val="left"/>
+            </w:pPr>
+            <w:r>
+              <w:rPr>
+                <w:rFonts w:cs="Calibri Light" w:ascii="Calibri Light" w:hAnsi="Calibri Light" w:asciiTheme="majorHAnsi" w:cstheme="majorHAnsi" w:hAnsiTheme="majorHAnsi"/>
+                <w:color w:themeColor="text1" w:val="000000"/>
+                <w:lang w:val="en-US"/>
+                <w:sz w:val="22"/>
+                <w:szCs w:val="22"/>
+              </w:rPr>
+              <w:t xml:space="preserve">Giảm 6,40%</w:t>
+            </w:r>
+          </w:p>
+        </w:tc>
+      </w:tr>
+      <w:tr>
+        <w:trPr>
+          <w:cantSplit/>
+        </w:trPr>
+        <w:tc>
+          <w:tcPr>
+            <w:tcW w:w="600" w:type="dxa"/>
+            <w:vAlign w:val="center"/>
+          </w:tcPr>
+          <w:p>
+            <w:pPr>
+              <w:spacing w:before="20" w:after="20" w:line="252" w:lineRule="auto"/>
+              <w:ind w:left="0" w:right="0" w:firstLine="0"/>
+              <w:jc w:val="center"/>
+            </w:pPr>
+            <w:r>
+              <w:rPr>
+                <w:rFonts w:cs="Calibri Light" w:ascii="Calibri Light" w:hAnsi="Calibri Light" w:asciiTheme="majorHAnsi" w:cstheme="majorHAnsi" w:hAnsiTheme="majorHAnsi"/>
+                <w:color w:themeColor="text1" w:val="000000"/>
+                <w:lang w:val="en-US"/>
+                <w:sz w:val="22"/>
+                <w:szCs w:val="22"/>
+              </w:rPr>
+              <w:t xml:space="preserve">6</w:t>
+            </w:r>
+          </w:p>
+        </w:tc>
+        <w:tc>
+          <w:tcPr>
+            <w:tcW w:w="3888" w:type="dxa"/>
+            <w:vAlign w:val="center"/>
+          </w:tcPr>
+          <w:p>
+            <w:pPr>
+              <w:spacing w:before="20" w:after="20" w:line="252" w:lineRule="auto"/>
+              <w:ind w:left="0" w:right="0" w:firstLine="0"/>
+              <w:jc w:val="left"/>
+            </w:pPr>
+            <w:r>
+              <w:rPr>
+                <w:rFonts w:cs="Calibri Light" w:ascii="Calibri Light" w:hAnsi="Calibri Light" w:asciiTheme="majorHAnsi" w:cstheme="majorHAnsi" w:hAnsiTheme="majorHAnsi"/>
+                <w:color w:themeColor="text1" w:val="000000"/>
+                <w:lang w:val="en-US"/>
+                <w:sz w:val="22"/>
+                <w:szCs w:val="22"/>
+              </w:rPr>
+              <w:t xml:space="preserve">Dự toán gói thầu</w:t>
+            </w:r>
+          </w:p>
+        </w:tc>
+        <w:tc>
+          <w:tcPr>
+            <w:tcW w:w="2100" w:type="dxa"/>
+            <w:vAlign w:val="center"/>
+          </w:tcPr>
+          <w:p>
+            <w:pPr>
+              <w:spacing w:before="20" w:after="20" w:line="252" w:lineRule="auto"/>
+              <w:ind w:left="0" w:right="0" w:firstLine="0"/>
+              <w:jc w:val="right"/>
+            </w:pPr>
+            <w:r>
+              <w:rPr>
+                <w:rFonts w:cs="Calibri Light" w:ascii="Calibri Light" w:hAnsi="Calibri Light" w:asciiTheme="majorHAnsi" w:cstheme="majorHAnsi" w:hAnsiTheme="majorHAnsi"/>
+                <w:color w:themeColor="text1" w:val="000000"/>
+                <w:lang w:val="en-US"/>
+                <w:sz w:val="22"/>
+                <w:szCs w:val="22"/>
+                <w:highlight w:val="yellow"/>
+              </w:rPr>
+              <w:t xml:space="preserve">……</w:t>
+            </w:r>
+          </w:p>
+        </w:tc>
+        <w:tc>
+          <w:tcPr>
+            <w:tcW w:w="2300" w:type="dxa"/>
+            <w:vAlign w:val="center"/>
+          </w:tcPr>
+          <w:p>
+            <w:pPr>
+              <w:spacing w:before="20" w:after="20" w:line="252" w:lineRule="auto"/>
+              <w:ind w:left="0" w:right="0" w:firstLine="0"/>
+              <w:jc w:val="left"/>
+            </w:pPr>
+            <w:r>
+              <w:rPr>
+                <w:rFonts w:cs="Calibri Light" w:ascii="Calibri Light" w:hAnsi="Calibri Light" w:asciiTheme="majorHAnsi" w:cstheme="majorHAnsi" w:hAnsiTheme="majorHAnsi"/>
+                <w:color w:themeColor="text1" w:val="000000"/>
+                <w:lang w:val="en-US"/>
+                <w:sz w:val="22"/>
+                <w:szCs w:val="22"/>
+              </w:rPr>
+              <w:t xml:space="preserve">Giảm </w:t>
+            </w:r>
+            <w:r>
+              <w:rPr>
+                <w:rFonts w:cs="Calibri Light" w:ascii="Calibri Light" w:hAnsi="Calibri Light" w:asciiTheme="majorHAnsi" w:cstheme="majorHAnsi" w:hAnsiTheme="majorHAnsi"/>
+                <w:color w:themeColor="text1" w:val="000000"/>
+                <w:lang w:val="en-US"/>
+                <w:sz w:val="22"/>
+                <w:szCs w:val="22"/>
+                <w:highlight w:val="yellow"/>
+              </w:rPr>
+              <w:t xml:space="preserve">……</w:t>
+            </w:r>
+            <w:r>
+              <w:rPr>
+                <w:rFonts w:cs="Calibri Light" w:ascii="Calibri Light" w:hAnsi="Calibri Light" w:asciiTheme="majorHAnsi" w:cstheme="majorHAnsi" w:hAnsiTheme="majorHAnsi"/>
+                <w:color w:themeColor="text1" w:val="000000"/>
+                <w:lang w:val="en-US"/>
+                <w:sz w:val="22"/>
+                <w:szCs w:val="22"/>
+              </w:rPr>
+              <w:t xml:space="preserve">% so với dự toán</w:t>
+            </w:r>
+          </w:p>
+        </w:tc>
+      </w:tr>
+    </w:tbl>
     <w:p>
       <w:pPr>
         <w:pStyle w:val="ListParagraph"/>
@@ -1229,439 +1810,1011 @@
         <w:t xml:space="preserve">2. Các điều kiện chính của hợp đồng</w:t>
       </w:r>
     </w:p>
-    <w:p>
-      <w:pPr>
-        <w:pStyle w:val="ListParagraph"/>
-        <w:numPr>
-          <w:ilvl w:val="0"/>
-          <w:numId w:val="0"/>
-        </w:numPr>
-        <w:spacing w:before="0" w:after="120"/>
-        <w:ind w:hanging="0" w:left="0"/>
-        <w:contextualSpacing w:val="false"/>
-        <w:rPr>
-          <w:rFonts w:ascii="Calibri Light" w:hAnsi="Calibri Light" w:cs="Calibri Light" w:asciiTheme="majorHAnsi" w:cstheme="majorHAnsi" w:hAnsiTheme="majorHAnsi"/>
-          <w:color w:themeColor="text1" w:val="000000"/>
-          <w:lang w:val="en-US"/>
-        </w:rPr>
-      </w:pPr>
-      <w:r>
-        <w:rPr>
-          <w:rFonts w:cs="Calibri Light" w:ascii="Calibri Light" w:hAnsi="Calibri Light" w:asciiTheme="majorHAnsi" w:cstheme="majorHAnsi" w:hAnsiTheme="majorHAnsi"/>
-          <w:b/>
-          <w:color w:themeColor="text1" w:val="000000"/>
-          <w:lang w:val="en-US"/>
-        </w:rPr>
-        <w:t xml:space="preserve">- Tạm ứng:</w:t>
-      </w:r>
-      <w:r>
-        <w:rPr>
-          <w:rFonts w:cs="Calibri Light" w:ascii="Calibri Light" w:hAnsi="Calibri Light" w:asciiTheme="majorHAnsi" w:cstheme="majorHAnsi" w:hAnsiTheme="majorHAnsi"/>
-          <w:color w:themeColor="text1" w:val="000000"/>
-          <w:lang w:val="en-US"/>
-        </w:rPr>
-        <w:t xml:space="preserve"> Phục Hưng đề xuất tạm ứng hợp đồng 25% giá trị hợp đồng trước VAT (50.078.488.098 đồng) và tạm ứng vật tư.</w:t>
-      </w:r>
-    </w:p>
-    <w:p>
-      <w:pPr>
-        <w:pStyle w:val="Normal"/>
-        <w:spacing w:lineRule="auto" w:line="240"/>
-        <w:ind w:left="0"/>
-        <w:rPr>
-          <w:rFonts w:ascii="Calibri Light" w:hAnsi="Calibri Light" w:cs="Calibri Light" w:asciiTheme="majorHAnsi" w:cstheme="majorHAnsi" w:hAnsiTheme="majorHAnsi"/>
-          <w:color w:themeColor="text1" w:val="000000"/>
-        </w:rPr>
-      </w:pPr>
-      <w:r>
-        <w:rPr>
-          <w:rFonts w:cs="Calibri Light" w:ascii="Calibri Light" w:hAnsi="Calibri Light" w:asciiTheme="majorHAnsi" w:cstheme="majorHAnsi" w:hAnsiTheme="majorHAnsi"/>
-          <w:color w:themeColor="text1" w:val="000000"/>
-          <w:lang w:val="en-US"/>
-        </w:rPr>
-        <w:t xml:space="preserve">+ </w:t>
-      </w:r>
-      <w:r>
-        <w:rPr>
-          <w:rFonts w:cs="Calibri Light" w:ascii="Calibri Light" w:hAnsi="Calibri Light" w:asciiTheme="majorHAnsi" w:cstheme="majorHAnsi" w:hAnsiTheme="majorHAnsi"/>
-          <w:b/>
-          <w:color w:themeColor="text1" w:val="000000"/>
-          <w:lang w:val="en-US"/>
-        </w:rPr>
-        <w:t xml:space="preserve">Điều kiện:</w:t>
-      </w:r>
-      <w:r>
-        <w:rPr>
-          <w:rFonts w:cs="Calibri Light" w:ascii="Calibri Light" w:hAnsi="Calibri Light" w:asciiTheme="majorHAnsi" w:cstheme="majorHAnsi" w:hAnsiTheme="majorHAnsi"/>
-          <w:color w:themeColor="text1" w:val="000000"/>
-          <w:lang w:val="en-US"/>
-        </w:rPr>
-        <w:t xml:space="preserve"> bảo lãnh tạm ứng 100% giá trị tạm ứng; Bên A tạm ứng trong 07 ngày làm việc kể từ ngày nhận đủ hồ sơ hợp lệ.</w:t>
-      </w:r>
-    </w:p>
-    <w:p>
-      <w:pPr>
-        <w:pStyle w:val="Normal"/>
-        <w:spacing w:lineRule="auto" w:line="240"/>
-        <w:ind w:left="0"/>
-        <w:rPr>
-          <w:rFonts w:ascii="Calibri Light" w:hAnsi="Calibri Light" w:cs="Calibri Light" w:asciiTheme="majorHAnsi" w:cstheme="majorHAnsi" w:hAnsiTheme="majorHAnsi"/>
-          <w:color w:themeColor="text1" w:val="000000"/>
-        </w:rPr>
-      </w:pPr>
-      <w:r>
-        <w:rPr>
-          <w:rFonts w:cs="Calibri Light" w:ascii="Calibri Light" w:hAnsi="Calibri Light" w:asciiTheme="majorHAnsi" w:cstheme="majorHAnsi" w:hAnsiTheme="majorHAnsi"/>
-          <w:color w:themeColor="text1" w:val="000000"/>
-          <w:lang w:val="en-US"/>
-        </w:rPr>
-        <w:t xml:space="preserve">+ </w:t>
-      </w:r>
-      <w:r>
-        <w:rPr>
-          <w:rFonts w:cs="Calibri Light" w:ascii="Calibri Light" w:hAnsi="Calibri Light" w:asciiTheme="majorHAnsi" w:cstheme="majorHAnsi" w:hAnsiTheme="majorHAnsi"/>
-          <w:b/>
-          <w:color w:themeColor="text1" w:val="000000"/>
-          <w:lang w:val="en-US"/>
-        </w:rPr>
-        <w:t xml:space="preserve">Thu hồi:</w:t>
-      </w:r>
-      <w:r>
-        <w:rPr>
-          <w:rFonts w:cs="Calibri Light" w:ascii="Calibri Light" w:hAnsi="Calibri Light" w:asciiTheme="majorHAnsi" w:cstheme="majorHAnsi" w:hAnsiTheme="majorHAnsi"/>
-          <w:color w:themeColor="text1" w:val="000000"/>
-          <w:lang w:val="en-US"/>
-        </w:rPr>
-        <w:t xml:space="preserve"> khấu trừ dần từ đợt thanh toán đầu tiên, thu hết khi khối lượng hoàn thành đạt 75% giá trị hợp đồng.</w:t>
-      </w:r>
-    </w:p>
-    <w:p>
-      <w:pPr>
-        <w:pStyle w:val="Normal"/>
-        <w:spacing w:lineRule="auto" w:line="240"/>
-        <w:ind w:left="0"/>
-        <w:rPr>
-          <w:rFonts w:ascii="Calibri Light" w:hAnsi="Calibri Light" w:cs="Calibri Light" w:asciiTheme="majorHAnsi" w:cstheme="majorHAnsi" w:hAnsiTheme="majorHAnsi"/>
-          <w:color w:themeColor="text1" w:val="000000"/>
-        </w:rPr>
-      </w:pPr>
-      <w:r>
-        <w:rPr>
-          <w:rFonts w:cs="Calibri Light" w:ascii="Calibri Light" w:hAnsi="Calibri Light" w:asciiTheme="majorHAnsi" w:cstheme="majorHAnsi" w:hAnsiTheme="majorHAnsi"/>
-          <w:color w:themeColor="text1" w:val="000000"/>
-          <w:lang w:val="en-US"/>
-        </w:rPr>
-        <w:t xml:space="preserve">+ </w:t>
-      </w:r>
-      <w:r>
-        <w:rPr>
-          <w:rFonts w:cs="Calibri Light" w:ascii="Calibri Light" w:hAnsi="Calibri Light" w:asciiTheme="majorHAnsi" w:cstheme="majorHAnsi" w:hAnsiTheme="majorHAnsi"/>
-          <w:b/>
-          <w:color w:themeColor="text1" w:val="000000"/>
-          <w:lang w:val="en-US"/>
-        </w:rPr>
-        <w:t xml:space="preserve">Tạm ứng vật tư (Phục Hưng đề xuất):</w:t>
-      </w:r>
-      <w:r>
-        <w:rPr>
-          <w:rFonts w:cs="Calibri Light" w:ascii="Calibri Light" w:hAnsi="Calibri Light" w:asciiTheme="majorHAnsi" w:cstheme="majorHAnsi" w:hAnsiTheme="majorHAnsi"/>
-          <w:color w:themeColor="text1" w:val="000000"/>
-          <w:lang w:val="en-US"/>
-        </w:rPr>
-        <w:t xml:space="preserve"> thép 7.500.000 đồng/tấn khi có biên bản nghiệm thu vật liệu đầu vào tại công trường; bê tông 1.000.000 đồng/m³ khi có biên bản nghiệm thu sau khi đổ bê tông.</w:t>
-      </w:r>
-    </w:p>
-    <w:p>
-      <w:pPr>
-        <w:pStyle w:val="Normal"/>
-        <w:spacing w:lineRule="auto" w:line="240"/>
-        <w:ind w:left="0"/>
-        <w:rPr>
-          <w:rFonts w:ascii="Calibri Light" w:hAnsi="Calibri Light" w:cs="Calibri Light" w:asciiTheme="majorHAnsi" w:cstheme="majorHAnsi" w:hAnsiTheme="majorHAnsi"/>
-          <w:color w:themeColor="text1" w:val="000000"/>
-        </w:rPr>
-      </w:pPr>
-      <w:r>
-        <w:rPr>
-          <w:rFonts w:cs="Calibri Light" w:ascii="Calibri Light" w:hAnsi="Calibri Light" w:asciiTheme="majorHAnsi" w:cstheme="majorHAnsi" w:hAnsiTheme="majorHAnsi"/>
-          <w:color w:themeColor="text1" w:val="000000"/>
-          <w:lang w:val="en-US"/>
-        </w:rPr>
-        <w:t xml:space="preserve">+ </w:t>
-      </w:r>
-      <w:r>
-        <w:rPr>
-          <w:rFonts w:cs="Calibri Light" w:ascii="Calibri Light" w:hAnsi="Calibri Light" w:asciiTheme="majorHAnsi" w:cstheme="majorHAnsi" w:hAnsiTheme="majorHAnsi"/>
-          <w:b/>
-          <w:color w:themeColor="text1" w:val="000000"/>
-          <w:lang w:val="en-US"/>
-        </w:rPr>
-        <w:t xml:space="preserve">Ý kiến BCH:</w:t>
-      </w:r>
-      <w:r>
-        <w:rPr>
-          <w:rFonts w:cs="Calibri Light" w:ascii="Calibri Light" w:hAnsi="Calibri Light" w:asciiTheme="majorHAnsi" w:cstheme="majorHAnsi" w:hAnsiTheme="majorHAnsi"/>
-          <w:color w:themeColor="text1" w:val="000000"/>
-          <w:lang w:val="en-US"/>
-        </w:rPr>
-        <w:t xml:space="preserve"> chấp thuận có điều kiện: mức tạm ứng không vượt đơn giá vật liệu tương ứng tại Biểu 01; thép phải có chứng chỉ, kết quả thí nghiệm đạt và được bảo quản tại công trường; thu hồi toàn bộ vào kỳ thanh toán gần nhất của khối lượng tương ứng; tổng tạm ứng (hợp đồng và vật tư) chưa thu hồi không vượt </w:t>
-      </w:r>
-      <w:r>
-        <w:rPr>
-          <w:rFonts w:cs="Calibri Light" w:ascii="Calibri Light" w:hAnsi="Calibri Light" w:asciiTheme="majorHAnsi" w:cstheme="majorHAnsi" w:hAnsiTheme="majorHAnsi"/>
-          <w:color w:themeColor="text1" w:val="000000"/>
-          <w:lang w:val="en-US"/>
-          <w:highlight w:val="yellow"/>
-        </w:rPr>
-        <w:t xml:space="preserve">……</w:t>
-      </w:r>
-      <w:r>
-        <w:rPr>
-          <w:rFonts w:cs="Calibri Light" w:ascii="Calibri Light" w:hAnsi="Calibri Light" w:asciiTheme="majorHAnsi" w:cstheme="majorHAnsi" w:hAnsiTheme="majorHAnsi"/>
-          <w:color w:themeColor="text1" w:val="000000"/>
-          <w:lang w:val="en-US"/>
-        </w:rPr>
-        <w:t xml:space="preserve">% giá trị hợp đồng.</w:t>
-      </w:r>
-    </w:p>
-    <w:p>
-      <w:pPr>
-        <w:pStyle w:val="ListParagraph"/>
-        <w:numPr>
-          <w:ilvl w:val="0"/>
-          <w:numId w:val="0"/>
-        </w:numPr>
-        <w:spacing w:before="0" w:after="120"/>
-        <w:ind w:hanging="0" w:left="0"/>
-        <w:contextualSpacing w:val="false"/>
-        <w:rPr>
-          <w:rFonts w:ascii="Calibri Light" w:hAnsi="Calibri Light" w:cs="Calibri Light" w:asciiTheme="majorHAnsi" w:cstheme="majorHAnsi" w:hAnsiTheme="majorHAnsi"/>
-          <w:color w:themeColor="text1" w:val="000000"/>
-          <w:lang w:val="en-US"/>
-        </w:rPr>
-      </w:pPr>
-      <w:r>
-        <w:rPr>
-          <w:rFonts w:cs="Calibri Light" w:ascii="Calibri Light" w:hAnsi="Calibri Light" w:asciiTheme="majorHAnsi" w:cstheme="majorHAnsi" w:hAnsiTheme="majorHAnsi"/>
-          <w:b/>
-          <w:color w:themeColor="text1" w:val="000000"/>
-          <w:lang w:val="en-US"/>
-        </w:rPr>
-        <w:t xml:space="preserve">- Thanh toán:</w:t>
-      </w:r>
-      <w:r>
-        <w:rPr>
-          <w:rFonts w:cs="Calibri Light" w:ascii="Calibri Light" w:hAnsi="Calibri Light" w:asciiTheme="majorHAnsi" w:cstheme="majorHAnsi" w:hAnsiTheme="majorHAnsi"/>
-          <w:color w:themeColor="text1" w:val="000000"/>
-          <w:lang w:val="en-US"/>
-        </w:rPr>
-        <w:t xml:space="preserve"> hằng tháng đến 90% giá trị nghiệm thu, sau khi trừ thu hồi tạm ứng và các khoản khấu trừ; Bên A xác nhận hồ sơ trong 15 ngày, thanh toán trong 14 ngày kể từ ngày xác nhận; không áp dụng lãi chậm thanh toán.</w:t>
-      </w:r>
-    </w:p>
-    <w:p>
-      <w:pPr>
-        <w:pStyle w:val="ListParagraph"/>
-        <w:numPr>
-          <w:ilvl w:val="0"/>
-          <w:numId w:val="0"/>
-        </w:numPr>
-        <w:spacing w:before="0" w:after="120"/>
-        <w:ind w:hanging="0" w:left="0"/>
-        <w:contextualSpacing w:val="false"/>
-        <w:rPr>
-          <w:rFonts w:ascii="Calibri Light" w:hAnsi="Calibri Light" w:cs="Calibri Light" w:asciiTheme="majorHAnsi" w:cstheme="majorHAnsi" w:hAnsiTheme="majorHAnsi"/>
-          <w:color w:themeColor="text1" w:val="000000"/>
-          <w:lang w:val="en-US"/>
-        </w:rPr>
-      </w:pPr>
-      <w:r>
-        <w:rPr>
-          <w:rFonts w:cs="Calibri Light" w:ascii="Calibri Light" w:hAnsi="Calibri Light" w:asciiTheme="majorHAnsi" w:cstheme="majorHAnsi" w:hAnsiTheme="majorHAnsi"/>
-          <w:b/>
-          <w:color w:themeColor="text1" w:val="000000"/>
-          <w:lang w:val="en-US"/>
-        </w:rPr>
-        <w:t xml:space="preserve">- Quyết toán:</w:t>
-      </w:r>
-      <w:r>
-        <w:rPr>
-          <w:rFonts w:cs="Calibri Light" w:ascii="Calibri Light" w:hAnsi="Calibri Light" w:asciiTheme="majorHAnsi" w:cstheme="majorHAnsi" w:hAnsiTheme="majorHAnsi"/>
-          <w:color w:themeColor="text1" w:val="000000"/>
-          <w:lang w:val="en-US"/>
-        </w:rPr>
-        <w:t xml:space="preserve"> Phục Hưng nộp hồ sơ trong 30 ngày sau khi hoàn thành; Bên A xác nhận trong 30 ngày, sau khi Chủ đầu tư phê duyệt quyết toán phần việc tương ứng; thanh toán đến 95% giá trị quyết toán trong 30 ngày kể từ ngày xác nhận.</w:t>
-      </w:r>
-    </w:p>
-    <w:p>
-      <w:pPr>
-        <w:pStyle w:val="ListParagraph"/>
-        <w:numPr>
-          <w:ilvl w:val="0"/>
-          <w:numId w:val="0"/>
-        </w:numPr>
-        <w:spacing w:before="0" w:after="120"/>
-        <w:ind w:hanging="0" w:left="0"/>
-        <w:contextualSpacing w:val="false"/>
-        <w:rPr>
-          <w:rFonts w:ascii="Calibri Light" w:hAnsi="Calibri Light" w:cs="Calibri Light" w:asciiTheme="majorHAnsi" w:cstheme="majorHAnsi" w:hAnsiTheme="majorHAnsi"/>
-          <w:color w:themeColor="text1" w:val="000000"/>
-          <w:lang w:val="en-US"/>
-        </w:rPr>
-      </w:pPr>
-      <w:r>
-        <w:rPr>
-          <w:rFonts w:cs="Calibri Light" w:ascii="Calibri Light" w:hAnsi="Calibri Light" w:asciiTheme="majorHAnsi" w:cstheme="majorHAnsi" w:hAnsiTheme="majorHAnsi"/>
-          <w:b/>
-          <w:color w:themeColor="text1" w:val="000000"/>
-          <w:lang w:val="en-US"/>
-        </w:rPr>
-        <w:t xml:space="preserve">- Bảo hành:</w:t>
-      </w:r>
-      <w:r>
-        <w:rPr>
-          <w:rFonts w:cs="Calibri Light" w:ascii="Calibri Light" w:hAnsi="Calibri Light" w:asciiTheme="majorHAnsi" w:cstheme="majorHAnsi" w:hAnsiTheme="majorHAnsi"/>
-          <w:color w:themeColor="text1" w:val="000000"/>
-          <w:lang w:val="en-US"/>
-        </w:rPr>
-        <w:t xml:space="preserve"> 36 tháng kể từ khi Chủ đầu tư nghiệm thu hoàn thành, không ngắn hơn thời hạn bảo hành theo Hợp đồng thầu chính; giữ lại 5% giá trị quyết toán, hoàn trả trong 30 ngày làm việc sau khi hết thời hạn bảo hành, hoặc thay bằng bảo lãnh bảo hành.</w:t>
-      </w:r>
-    </w:p>
-    <w:p>
-      <w:pPr>
-        <w:pStyle w:val="ListParagraph"/>
-        <w:numPr>
-          <w:ilvl w:val="0"/>
-          <w:numId w:val="0"/>
-        </w:numPr>
-        <w:spacing w:before="0" w:after="120"/>
-        <w:ind w:hanging="0" w:left="0"/>
-        <w:contextualSpacing w:val="false"/>
-        <w:rPr>
-          <w:rFonts w:ascii="Calibri Light" w:hAnsi="Calibri Light" w:cs="Calibri Light" w:asciiTheme="majorHAnsi" w:cstheme="majorHAnsi" w:hAnsiTheme="majorHAnsi"/>
-          <w:color w:themeColor="text1" w:val="000000"/>
-          <w:lang w:val="en-US"/>
-        </w:rPr>
-      </w:pPr>
-      <w:r>
-        <w:rPr>
-          <w:rFonts w:cs="Calibri Light" w:ascii="Calibri Light" w:hAnsi="Calibri Light" w:asciiTheme="majorHAnsi" w:cstheme="majorHAnsi" w:hAnsiTheme="majorHAnsi"/>
-          <w:b/>
-          <w:color w:themeColor="text1" w:val="000000"/>
-          <w:lang w:val="en-US"/>
-        </w:rPr>
-        <w:t xml:space="preserve">- Bảo lãnh của Phục Hưng:</w:t>
-      </w:r>
-      <w:r>
-        <w:rPr>
-          <w:rFonts w:cs="Calibri Light" w:ascii="Calibri Light" w:hAnsi="Calibri Light" w:asciiTheme="majorHAnsi" w:cstheme="majorHAnsi" w:hAnsiTheme="majorHAnsi"/>
-          <w:color w:themeColor="text1" w:val="000000"/>
-          <w:lang w:val="en-US"/>
-        </w:rPr>
-        <w:t xml:space="preserve"> bảo lãnh tạm ứng 100%; bảo lãnh thực hiện hợp đồng 5% giá trị hợp đồng (nộp trong 14 ngày kể từ ngày ký); bảo lãnh bảo hành 5% giá trị quyết toán.</w:t>
-      </w:r>
-    </w:p>
-    <w:p>
-      <w:pPr>
-        <w:pStyle w:val="ListParagraph"/>
-        <w:numPr>
-          <w:ilvl w:val="0"/>
-          <w:numId w:val="0"/>
-        </w:numPr>
-        <w:spacing w:before="0" w:after="120"/>
-        <w:ind w:hanging="0" w:left="0"/>
-        <w:contextualSpacing w:val="false"/>
-        <w:rPr>
-          <w:rFonts w:ascii="Calibri Light" w:hAnsi="Calibri Light" w:cs="Calibri Light" w:asciiTheme="majorHAnsi" w:cstheme="majorHAnsi" w:hAnsiTheme="majorHAnsi"/>
-          <w:color w:themeColor="text1" w:val="000000"/>
-          <w:lang w:val="en-US"/>
-        </w:rPr>
-      </w:pPr>
-      <w:r>
-        <w:rPr>
-          <w:rFonts w:cs="Calibri Light" w:ascii="Calibri Light" w:hAnsi="Calibri Light" w:asciiTheme="majorHAnsi" w:cstheme="majorHAnsi" w:hAnsiTheme="majorHAnsi"/>
-          <w:b/>
-          <w:color w:themeColor="text1" w:val="000000"/>
-          <w:lang w:val="en-US"/>
-        </w:rPr>
-        <w:t xml:space="preserve">- Bảo lãnh thanh toán của VNCN E&amp;C:</w:t>
-      </w:r>
-      <w:r>
-        <w:rPr>
-          <w:rFonts w:cs="Calibri Light" w:ascii="Calibri Light" w:hAnsi="Calibri Light" w:asciiTheme="majorHAnsi" w:cstheme="majorHAnsi" w:hAnsiTheme="majorHAnsi"/>
-          <w:color w:themeColor="text1" w:val="000000"/>
-          <w:lang w:val="en-US"/>
-        </w:rPr>
-        <w:t xml:space="preserve"> không áp dụng (Phục Hưng đề nghị bảo lãnh 15% giá trị hợp đồng, BCH đề xuất không chấp thuận).</w:t>
-      </w:r>
-    </w:p>
-    <w:p>
-      <w:pPr>
-        <w:pStyle w:val="ListParagraph"/>
-        <w:numPr>
-          <w:ilvl w:val="0"/>
-          <w:numId w:val="0"/>
-        </w:numPr>
-        <w:spacing w:before="0" w:after="120"/>
-        <w:ind w:hanging="0" w:left="0"/>
-        <w:contextualSpacing w:val="false"/>
-        <w:rPr>
-          <w:rFonts w:ascii="Calibri Light" w:hAnsi="Calibri Light" w:cs="Calibri Light" w:asciiTheme="majorHAnsi" w:cstheme="majorHAnsi" w:hAnsiTheme="majorHAnsi"/>
-          <w:color w:themeColor="text1" w:val="000000"/>
-          <w:lang w:val="en-US"/>
-        </w:rPr>
-      </w:pPr>
-      <w:r>
-        <w:rPr>
-          <w:rFonts w:cs="Calibri Light" w:ascii="Calibri Light" w:hAnsi="Calibri Light" w:asciiTheme="majorHAnsi" w:cstheme="majorHAnsi" w:hAnsiTheme="majorHAnsi"/>
-          <w:b/>
-          <w:color w:themeColor="text1" w:val="000000"/>
-          <w:lang w:val="en-US"/>
-        </w:rPr>
-        <w:t xml:space="preserve">- Phạt vi phạm:</w:t>
-      </w:r>
-      <w:r>
-        <w:rPr>
-          <w:rFonts w:cs="Calibri Light" w:ascii="Calibri Light" w:hAnsi="Calibri Light" w:asciiTheme="majorHAnsi" w:cstheme="majorHAnsi" w:hAnsiTheme="majorHAnsi"/>
-          <w:color w:themeColor="text1" w:val="000000"/>
-          <w:lang w:val="en-US"/>
-        </w:rPr>
-        <w:t xml:space="preserve"> chậm tiến độ 0,1%/ngày, tối đa 8%; tổng mức phạt không quá 10% giá trị hợp đồng.</w:t>
-      </w:r>
-    </w:p>
-    <w:p>
-      <w:pPr>
-        <w:pStyle w:val="ListParagraph"/>
-        <w:numPr>
-          <w:ilvl w:val="0"/>
-          <w:numId w:val="0"/>
-        </w:numPr>
-        <w:spacing w:before="0" w:after="120"/>
-        <w:ind w:hanging="0" w:left="0"/>
-        <w:contextualSpacing w:val="false"/>
-        <w:rPr>
-          <w:rFonts w:ascii="Calibri Light" w:hAnsi="Calibri Light" w:cs="Calibri Light" w:asciiTheme="majorHAnsi" w:cstheme="majorHAnsi" w:hAnsiTheme="majorHAnsi"/>
-          <w:color w:themeColor="text1" w:val="000000"/>
-          <w:lang w:val="en-US"/>
-        </w:rPr>
-      </w:pPr>
-      <w:r>
-        <w:rPr>
-          <w:rFonts w:cs="Calibri Light" w:ascii="Calibri Light" w:hAnsi="Calibri Light" w:asciiTheme="majorHAnsi" w:cstheme="majorHAnsi" w:hAnsiTheme="majorHAnsi"/>
-          <w:b/>
-          <w:color w:themeColor="text1" w:val="000000"/>
-          <w:lang w:val="en-US"/>
-        </w:rPr>
-        <w:t xml:space="preserve">- Nội dung còn để ngỏ:</w:t>
-      </w:r>
-      <w:r>
-        <w:rPr>
-          <w:rFonts w:cs="Calibri Light" w:ascii="Calibri Light" w:hAnsi="Calibri Light" w:asciiTheme="majorHAnsi" w:cstheme="majorHAnsi" w:hAnsiTheme="majorHAnsi"/>
-          <w:color w:themeColor="text1" w:val="000000"/>
-          <w:lang w:val="en-US"/>
-        </w:rPr>
-        <w:t xml:space="preserve"> tiến độ thực hiện (Điều 7.1).</w:t>
-      </w:r>
-    </w:p>
+    <w:tbl>
+      <w:tblPr>
+        <w:tblW w:w="8888" w:type="dxa"/>
+        <w:tblInd w:w="198" w:type="dxa"/>
+        <w:tblBorders>
+          <w:top w:val="single" w:sz="4" w:space="0" w:color="000000"/>
+          <w:left w:val="single" w:sz="4" w:space="0" w:color="000000"/>
+          <w:bottom w:val="single" w:sz="4" w:space="0" w:color="000000"/>
+          <w:right w:val="single" w:sz="4" w:space="0" w:color="000000"/>
+          <w:insideH w:val="single" w:sz="4" w:space="0" w:color="000000"/>
+          <w:insideV w:val="single" w:sz="4" w:space="0" w:color="000000"/>
+        </w:tblBorders>
+        <w:tblLayout w:type="fixed"/>
+        <w:tblCellMar>
+          <w:left w:w="85" w:type="dxa"/>
+          <w:right w:w="85" w:type="dxa"/>
+        </w:tblCellMar>
+      </w:tblPr>
+      <w:tblGrid>
+        <w:gridCol w:w="1700"/>
+        <w:gridCol w:w="4088"/>
+        <w:gridCol w:w="3100"/>
+      </w:tblGrid>
+      <w:tr>
+        <w:trPr>
+          <w:cantSplit/>
+          <w:tblHeader/>
+        </w:trPr>
+        <w:tc>
+          <w:tcPr>
+            <w:tcW w:w="1700" w:type="dxa"/>
+            <w:shd w:val="clear" w:color="auto" w:fill="D9D9D9"/>
+            <w:vAlign w:val="center"/>
+          </w:tcPr>
+          <w:p>
+            <w:pPr>
+              <w:spacing w:before="20" w:after="20" w:line="252" w:lineRule="auto"/>
+              <w:ind w:left="0" w:right="0" w:firstLine="0"/>
+              <w:jc w:val="center"/>
+            </w:pPr>
+            <w:r>
+              <w:rPr>
+                <w:rFonts w:cs="Calibri Light" w:ascii="Calibri Light" w:hAnsi="Calibri Light" w:asciiTheme="majorHAnsi" w:cstheme="majorHAnsi" w:hAnsiTheme="majorHAnsi"/>
+                <w:b/>
+                <w:color w:themeColor="text1" w:val="000000"/>
+                <w:lang w:val="en-US"/>
+                <w:sz w:val="22"/>
+                <w:szCs w:val="22"/>
+              </w:rPr>
+              <w:t xml:space="preserve">Nội dung</w:t>
+            </w:r>
+          </w:p>
+        </w:tc>
+        <w:tc>
+          <w:tcPr>
+            <w:tcW w:w="4088" w:type="dxa"/>
+            <w:shd w:val="clear" w:color="auto" w:fill="D9D9D9"/>
+            <w:vAlign w:val="center"/>
+          </w:tcPr>
+          <w:p>
+            <w:pPr>
+              <w:spacing w:before="20" w:after="20" w:line="252" w:lineRule="auto"/>
+              <w:ind w:left="0" w:right="0" w:firstLine="0"/>
+              <w:jc w:val="center"/>
+            </w:pPr>
+            <w:r>
+              <w:rPr>
+                <w:rFonts w:cs="Calibri Light" w:ascii="Calibri Light" w:hAnsi="Calibri Light" w:asciiTheme="majorHAnsi" w:cstheme="majorHAnsi" w:hAnsiTheme="majorHAnsi"/>
+                <w:b/>
+                <w:color w:themeColor="text1" w:val="000000"/>
+                <w:lang w:val="en-US"/>
+                <w:sz w:val="22"/>
+                <w:szCs w:val="22"/>
+              </w:rPr>
+              <w:t xml:space="preserve">Điều kiện theo dự thảo hợp đồng</w:t>
+            </w:r>
+          </w:p>
+        </w:tc>
+        <w:tc>
+          <w:tcPr>
+            <w:tcW w:w="3100" w:type="dxa"/>
+            <w:shd w:val="clear" w:color="auto" w:fill="D9D9D9"/>
+            <w:vAlign w:val="center"/>
+          </w:tcPr>
+          <w:p>
+            <w:pPr>
+              <w:spacing w:before="20" w:after="20" w:line="252" w:lineRule="auto"/>
+              <w:ind w:left="0" w:right="0" w:firstLine="0"/>
+              <w:jc w:val="center"/>
+            </w:pPr>
+            <w:r>
+              <w:rPr>
+                <w:rFonts w:cs="Calibri Light" w:ascii="Calibri Light" w:hAnsi="Calibri Light" w:asciiTheme="majorHAnsi" w:cstheme="majorHAnsi" w:hAnsiTheme="majorHAnsi"/>
+                <w:b/>
+                <w:color w:themeColor="text1" w:val="000000"/>
+                <w:lang w:val="en-US"/>
+                <w:sz w:val="22"/>
+                <w:szCs w:val="22"/>
+              </w:rPr>
+              <w:t xml:space="preserve">Ý kiến/ Đề xuất của BCH</w:t>
+            </w:r>
+          </w:p>
+        </w:tc>
+      </w:tr>
+      <w:tr>
+        <w:trPr>
+          <w:cantSplit/>
+        </w:trPr>
+        <w:tc>
+          <w:tcPr>
+            <w:tcW w:w="1700" w:type="dxa"/>
+            <w:vAlign w:val="center"/>
+          </w:tcPr>
+          <w:p>
+            <w:pPr>
+              <w:spacing w:before="20" w:after="20" w:line="252" w:lineRule="auto"/>
+              <w:ind w:left="0" w:right="0" w:firstLine="0"/>
+              <w:jc w:val="left"/>
+            </w:pPr>
+            <w:r>
+              <w:rPr>
+                <w:rFonts w:cs="Calibri Light" w:ascii="Calibri Light" w:hAnsi="Calibri Light" w:asciiTheme="majorHAnsi" w:cstheme="majorHAnsi" w:hAnsiTheme="majorHAnsi"/>
+                <w:b/>
+                <w:color w:themeColor="text1" w:val="000000"/>
+                <w:lang w:val="en-US"/>
+                <w:sz w:val="22"/>
+                <w:szCs w:val="22"/>
+              </w:rPr>
+              <w:t xml:space="preserve">Tạm ứng hợp đồng</w:t>
+            </w:r>
+          </w:p>
+        </w:tc>
+        <w:tc>
+          <w:tcPr>
+            <w:tcW w:w="4088" w:type="dxa"/>
+            <w:vAlign w:val="center"/>
+          </w:tcPr>
+          <w:p>
+            <w:pPr>
+              <w:spacing w:before="20" w:after="20" w:line="252" w:lineRule="auto"/>
+              <w:ind w:left="0" w:right="0" w:firstLine="0"/>
+              <w:jc w:val="left"/>
+            </w:pPr>
+            <w:r>
+              <w:rPr>
+                <w:rFonts w:cs="Calibri Light" w:ascii="Calibri Light" w:hAnsi="Calibri Light" w:asciiTheme="majorHAnsi" w:cstheme="majorHAnsi" w:hAnsiTheme="majorHAnsi"/>
+                <w:color w:themeColor="text1" w:val="000000"/>
+                <w:lang w:val="en-US"/>
+                <w:sz w:val="22"/>
+                <w:szCs w:val="22"/>
+              </w:rPr>
+              <w:t xml:space="preserve">25% giá trị hợp đồng trước VAT = </w:t>
+            </w:r>
+            <w:r>
+              <w:rPr>
+                <w:rFonts w:cs="Calibri Light" w:ascii="Calibri Light" w:hAnsi="Calibri Light" w:asciiTheme="majorHAnsi" w:cstheme="majorHAnsi" w:hAnsiTheme="majorHAnsi"/>
+                <w:b/>
+                <w:color w:themeColor="text1" w:val="000000"/>
+                <w:lang w:val="en-US"/>
+                <w:sz w:val="22"/>
+                <w:szCs w:val="22"/>
+              </w:rPr>
+              <w:t xml:space="preserve">50.078.488.098 đồng</w:t>
+            </w:r>
+            <w:r>
+              <w:rPr>
+                <w:rFonts w:cs="Calibri Light" w:ascii="Calibri Light" w:hAnsi="Calibri Light" w:asciiTheme="majorHAnsi" w:cstheme="majorHAnsi" w:hAnsiTheme="majorHAnsi"/>
+                <w:color w:themeColor="text1" w:val="000000"/>
+                <w:lang w:val="en-US"/>
+                <w:sz w:val="22"/>
+                <w:szCs w:val="22"/>
+              </w:rPr>
+              <w:t xml:space="preserve">.</w:t>
+            </w:r>
+          </w:p>
+          <w:p>
+            <w:pPr>
+              <w:spacing w:before="20" w:after="20" w:line="252" w:lineRule="auto"/>
+              <w:ind w:left="0" w:right="0" w:firstLine="0"/>
+              <w:jc w:val="left"/>
+            </w:pPr>
+            <w:r>
+              <w:rPr>
+                <w:rFonts w:cs="Calibri Light" w:ascii="Calibri Light" w:hAnsi="Calibri Light" w:asciiTheme="majorHAnsi" w:cstheme="majorHAnsi" w:hAnsiTheme="majorHAnsi"/>
+                <w:color w:themeColor="text1" w:val="000000"/>
+                <w:lang w:val="en-US"/>
+                <w:sz w:val="22"/>
+                <w:szCs w:val="22"/>
+              </w:rPr>
+              <w:t xml:space="preserve">Điều kiện: bảo lãnh tạm ứng 100%; Bên A tạm ứng trong 07 ngày làm việc kể từ ngày nhận đủ hồ sơ.</w:t>
+            </w:r>
+          </w:p>
+          <w:p>
+            <w:pPr>
+              <w:spacing w:before="20" w:after="20" w:line="252" w:lineRule="auto"/>
+              <w:ind w:left="0" w:right="0" w:firstLine="0"/>
+              <w:jc w:val="left"/>
+            </w:pPr>
+            <w:r>
+              <w:rPr>
+                <w:rFonts w:cs="Calibri Light" w:ascii="Calibri Light" w:hAnsi="Calibri Light" w:asciiTheme="majorHAnsi" w:cstheme="majorHAnsi" w:hAnsiTheme="majorHAnsi"/>
+                <w:color w:themeColor="text1" w:val="000000"/>
+                <w:lang w:val="en-US"/>
+                <w:sz w:val="22"/>
+                <w:szCs w:val="22"/>
+              </w:rPr>
+              <w:t xml:space="preserve">Thu hồi: khấu trừ dần từ đợt thanh toán đầu, thu hết khi khối lượng hoàn thành đạt 75% giá trị hợp đồng.</w:t>
+            </w:r>
+          </w:p>
+        </w:tc>
+        <w:tc>
+          <w:tcPr>
+            <w:tcW w:w="3100" w:type="dxa"/>
+            <w:vAlign w:val="center"/>
+          </w:tcPr>
+          <w:p>
+            <w:pPr>
+              <w:spacing w:before="20" w:after="20" w:line="252" w:lineRule="auto"/>
+              <w:ind w:left="0" w:right="0" w:firstLine="0"/>
+              <w:jc w:val="left"/>
+            </w:pPr>
+            <w:r>
+              <w:rPr>
+                <w:rFonts w:cs="Calibri Light" w:ascii="Calibri Light" w:hAnsi="Calibri Light" w:asciiTheme="majorHAnsi" w:cstheme="majorHAnsi" w:hAnsiTheme="majorHAnsi"/>
+                <w:color w:themeColor="text1" w:val="000000"/>
+                <w:lang w:val="en-US"/>
+                <w:sz w:val="22"/>
+                <w:szCs w:val="22"/>
+              </w:rPr>
+              <w:t xml:space="preserve">Thống nhất theo kết quả thương thảo.</w:t>
+            </w:r>
+          </w:p>
+        </w:tc>
+      </w:tr>
+      <w:tr>
+        <w:trPr>
+          <w:cantSplit/>
+        </w:trPr>
+        <w:tc>
+          <w:tcPr>
+            <w:tcW w:w="1700" w:type="dxa"/>
+            <w:vAlign w:val="center"/>
+          </w:tcPr>
+          <w:p>
+            <w:pPr>
+              <w:spacing w:before="20" w:after="20" w:line="252" w:lineRule="auto"/>
+              <w:ind w:left="0" w:right="0" w:firstLine="0"/>
+              <w:jc w:val="left"/>
+            </w:pPr>
+            <w:r>
+              <w:rPr>
+                <w:rFonts w:cs="Calibri Light" w:ascii="Calibri Light" w:hAnsi="Calibri Light" w:asciiTheme="majorHAnsi" w:cstheme="majorHAnsi" w:hAnsiTheme="majorHAnsi"/>
+                <w:b/>
+                <w:color w:themeColor="text1" w:val="000000"/>
+                <w:lang w:val="en-US"/>
+                <w:sz w:val="22"/>
+                <w:szCs w:val="22"/>
+              </w:rPr>
+              <w:t xml:space="preserve">Tạm ứng vật tư</w:t>
+            </w:r>
+          </w:p>
+        </w:tc>
+        <w:tc>
+          <w:tcPr>
+            <w:tcW w:w="4088" w:type="dxa"/>
+            <w:vAlign w:val="center"/>
+          </w:tcPr>
+          <w:p>
+            <w:pPr>
+              <w:spacing w:before="20" w:after="20" w:line="252" w:lineRule="auto"/>
+              <w:ind w:left="0" w:right="0" w:firstLine="0"/>
+              <w:jc w:val="left"/>
+            </w:pPr>
+            <w:r>
+              <w:rPr>
+                <w:rFonts w:cs="Calibri Light" w:ascii="Calibri Light" w:hAnsi="Calibri Light" w:asciiTheme="majorHAnsi" w:cstheme="majorHAnsi" w:hAnsiTheme="majorHAnsi"/>
+                <w:color w:themeColor="text1" w:val="000000"/>
+                <w:lang w:val="en-US"/>
+                <w:sz w:val="22"/>
+                <w:szCs w:val="22"/>
+              </w:rPr>
+              <w:t xml:space="preserve">Phục Hưng đề xuất:</w:t>
+            </w:r>
+          </w:p>
+          <w:p>
+            <w:pPr>
+              <w:spacing w:before="20" w:after="20" w:line="252" w:lineRule="auto"/>
+              <w:ind w:left="0" w:right="0" w:firstLine="0"/>
+              <w:jc w:val="left"/>
+            </w:pPr>
+            <w:r>
+              <w:rPr>
+                <w:rFonts w:cs="Calibri Light" w:ascii="Calibri Light" w:hAnsi="Calibri Light" w:asciiTheme="majorHAnsi" w:cstheme="majorHAnsi" w:hAnsiTheme="majorHAnsi"/>
+                <w:color w:themeColor="text1" w:val="000000"/>
+                <w:lang w:val="en-US"/>
+                <w:sz w:val="22"/>
+                <w:szCs w:val="22"/>
+              </w:rPr>
+              <w:t xml:space="preserve">– Thép: </w:t>
+            </w:r>
+            <w:r>
+              <w:rPr>
+                <w:rFonts w:cs="Calibri Light" w:ascii="Calibri Light" w:hAnsi="Calibri Light" w:asciiTheme="majorHAnsi" w:cstheme="majorHAnsi" w:hAnsiTheme="majorHAnsi"/>
+                <w:b/>
+                <w:color w:themeColor="text1" w:val="000000"/>
+                <w:lang w:val="en-US"/>
+                <w:sz w:val="22"/>
+                <w:szCs w:val="22"/>
+              </w:rPr>
+              <w:t xml:space="preserve">7.500.000 đồng/tấn</w:t>
+            </w:r>
+            <w:r>
+              <w:rPr>
+                <w:rFonts w:cs="Calibri Light" w:ascii="Calibri Light" w:hAnsi="Calibri Light" w:asciiTheme="majorHAnsi" w:cstheme="majorHAnsi" w:hAnsiTheme="majorHAnsi"/>
+                <w:color w:themeColor="text1" w:val="000000"/>
+                <w:lang w:val="en-US"/>
+                <w:sz w:val="22"/>
+                <w:szCs w:val="22"/>
+              </w:rPr>
+              <w:t xml:space="preserve"> khi có biên bản nghiệm thu vật liệu đầu vào tại công trường.</w:t>
+            </w:r>
+          </w:p>
+          <w:p>
+            <w:pPr>
+              <w:spacing w:before="20" w:after="20" w:line="252" w:lineRule="auto"/>
+              <w:ind w:left="0" w:right="0" w:firstLine="0"/>
+              <w:jc w:val="left"/>
+            </w:pPr>
+            <w:r>
+              <w:rPr>
+                <w:rFonts w:cs="Calibri Light" w:ascii="Calibri Light" w:hAnsi="Calibri Light" w:asciiTheme="majorHAnsi" w:cstheme="majorHAnsi" w:hAnsiTheme="majorHAnsi"/>
+                <w:color w:themeColor="text1" w:val="000000"/>
+                <w:lang w:val="en-US"/>
+                <w:sz w:val="22"/>
+                <w:szCs w:val="22"/>
+              </w:rPr>
+              <w:t xml:space="preserve">– Bê tông: </w:t>
+            </w:r>
+            <w:r>
+              <w:rPr>
+                <w:rFonts w:cs="Calibri Light" w:ascii="Calibri Light" w:hAnsi="Calibri Light" w:asciiTheme="majorHAnsi" w:cstheme="majorHAnsi" w:hAnsiTheme="majorHAnsi"/>
+                <w:b/>
+                <w:color w:themeColor="text1" w:val="000000"/>
+                <w:lang w:val="en-US"/>
+                <w:sz w:val="22"/>
+                <w:szCs w:val="22"/>
+              </w:rPr>
+              <w:t xml:space="preserve">1.000.000 đồng/m³</w:t>
+            </w:r>
+            <w:r>
+              <w:rPr>
+                <w:rFonts w:cs="Calibri Light" w:ascii="Calibri Light" w:hAnsi="Calibri Light" w:asciiTheme="majorHAnsi" w:cstheme="majorHAnsi" w:hAnsiTheme="majorHAnsi"/>
+                <w:color w:themeColor="text1" w:val="000000"/>
+                <w:lang w:val="en-US"/>
+                <w:sz w:val="22"/>
+                <w:szCs w:val="22"/>
+              </w:rPr>
+              <w:t xml:space="preserve"> khi có biên bản nghiệm thu sau khi đổ bê tông.</w:t>
+            </w:r>
+          </w:p>
+        </w:tc>
+        <w:tc>
+          <w:tcPr>
+            <w:tcW w:w="3100" w:type="dxa"/>
+            <w:vAlign w:val="center"/>
+          </w:tcPr>
+          <w:p>
+            <w:pPr>
+              <w:spacing w:before="20" w:after="20" w:line="252" w:lineRule="auto"/>
+              <w:ind w:left="0" w:right="0" w:firstLine="0"/>
+              <w:jc w:val="left"/>
+            </w:pPr>
+            <w:r>
+              <w:rPr>
+                <w:rFonts w:cs="Calibri Light" w:ascii="Calibri Light" w:hAnsi="Calibri Light" w:asciiTheme="majorHAnsi" w:cstheme="majorHAnsi" w:hAnsiTheme="majorHAnsi"/>
+                <w:color w:themeColor="text1" w:val="000000"/>
+                <w:lang w:val="en-US"/>
+                <w:sz w:val="22"/>
+                <w:szCs w:val="22"/>
+              </w:rPr>
+              <w:t xml:space="preserve">Chấp thuận có điều kiện: mức tạm ứng không vượt đơn giá vật liệu tại Biểu 01; thép có chứng chỉ, thí nghiệm đạt, bảo quản tại công trường; thu hồi toàn bộ vào kỳ thanh toán gần nhất của khối lượng tương ứng; tổng tạm ứng chưa thu hồi không vượt </w:t>
+            </w:r>
+            <w:r>
+              <w:rPr>
+                <w:rFonts w:cs="Calibri Light" w:ascii="Calibri Light" w:hAnsi="Calibri Light" w:asciiTheme="majorHAnsi" w:cstheme="majorHAnsi" w:hAnsiTheme="majorHAnsi"/>
+                <w:color w:themeColor="text1" w:val="000000"/>
+                <w:lang w:val="en-US"/>
+                <w:sz w:val="22"/>
+                <w:szCs w:val="22"/>
+                <w:highlight w:val="yellow"/>
+              </w:rPr>
+              <w:t xml:space="preserve">……</w:t>
+            </w:r>
+            <w:r>
+              <w:rPr>
+                <w:rFonts w:cs="Calibri Light" w:ascii="Calibri Light" w:hAnsi="Calibri Light" w:asciiTheme="majorHAnsi" w:cstheme="majorHAnsi" w:hAnsiTheme="majorHAnsi"/>
+                <w:color w:themeColor="text1" w:val="000000"/>
+                <w:lang w:val="en-US"/>
+                <w:sz w:val="22"/>
+                <w:szCs w:val="22"/>
+              </w:rPr>
+              <w:t xml:space="preserve">% giá trị hợp đồng.</w:t>
+            </w:r>
+          </w:p>
+        </w:tc>
+      </w:tr>
+      <w:tr>
+        <w:trPr>
+          <w:cantSplit/>
+        </w:trPr>
+        <w:tc>
+          <w:tcPr>
+            <w:tcW w:w="1700" w:type="dxa"/>
+            <w:vAlign w:val="center"/>
+          </w:tcPr>
+          <w:p>
+            <w:pPr>
+              <w:spacing w:before="20" w:after="20" w:line="252" w:lineRule="auto"/>
+              <w:ind w:left="0" w:right="0" w:firstLine="0"/>
+              <w:jc w:val="left"/>
+            </w:pPr>
+            <w:r>
+              <w:rPr>
+                <w:rFonts w:cs="Calibri Light" w:ascii="Calibri Light" w:hAnsi="Calibri Light" w:asciiTheme="majorHAnsi" w:cstheme="majorHAnsi" w:hAnsiTheme="majorHAnsi"/>
+                <w:b/>
+                <w:color w:themeColor="text1" w:val="000000"/>
+                <w:lang w:val="en-US"/>
+                <w:sz w:val="22"/>
+                <w:szCs w:val="22"/>
+              </w:rPr>
+              <w:t xml:space="preserve">Thanh toán</w:t>
+            </w:r>
+          </w:p>
+        </w:tc>
+        <w:tc>
+          <w:tcPr>
+            <w:tcW w:w="4088" w:type="dxa"/>
+            <w:vAlign w:val="center"/>
+          </w:tcPr>
+          <w:p>
+            <w:pPr>
+              <w:spacing w:before="20" w:after="20" w:line="252" w:lineRule="auto"/>
+              <w:ind w:left="0" w:right="0" w:firstLine="0"/>
+              <w:jc w:val="left"/>
+            </w:pPr>
+            <w:r>
+              <w:rPr>
+                <w:rFonts w:cs="Calibri Light" w:ascii="Calibri Light" w:hAnsi="Calibri Light" w:asciiTheme="majorHAnsi" w:cstheme="majorHAnsi" w:hAnsiTheme="majorHAnsi"/>
+                <w:color w:themeColor="text1" w:val="000000"/>
+                <w:lang w:val="en-US"/>
+                <w:sz w:val="22"/>
+                <w:szCs w:val="22"/>
+              </w:rPr>
+              <w:t xml:space="preserve">Hằng tháng đến 90% giá trị nghiệm thu, sau khi trừ thu hồi tạm ứng và các khoản khấu trừ.</w:t>
+            </w:r>
+          </w:p>
+          <w:p>
+            <w:pPr>
+              <w:spacing w:before="20" w:after="20" w:line="252" w:lineRule="auto"/>
+              <w:ind w:left="0" w:right="0" w:firstLine="0"/>
+              <w:jc w:val="left"/>
+            </w:pPr>
+            <w:r>
+              <w:rPr>
+                <w:rFonts w:cs="Calibri Light" w:ascii="Calibri Light" w:hAnsi="Calibri Light" w:asciiTheme="majorHAnsi" w:cstheme="majorHAnsi" w:hAnsiTheme="majorHAnsi"/>
+                <w:color w:themeColor="text1" w:val="000000"/>
+                <w:lang w:val="en-US"/>
+                <w:sz w:val="22"/>
+                <w:szCs w:val="22"/>
+              </w:rPr>
+              <w:t xml:space="preserve">Bên A xác nhận hồ sơ trong 15 ngày; thanh toán trong 14 ngày kể từ ngày xác nhận.</w:t>
+            </w:r>
+          </w:p>
+          <w:p>
+            <w:pPr>
+              <w:spacing w:before="20" w:after="20" w:line="252" w:lineRule="auto"/>
+              <w:ind w:left="0" w:right="0" w:firstLine="0"/>
+              <w:jc w:val="left"/>
+            </w:pPr>
+            <w:r>
+              <w:rPr>
+                <w:rFonts w:cs="Calibri Light" w:ascii="Calibri Light" w:hAnsi="Calibri Light" w:asciiTheme="majorHAnsi" w:cstheme="majorHAnsi" w:hAnsiTheme="majorHAnsi"/>
+                <w:color w:themeColor="text1" w:val="000000"/>
+                <w:lang w:val="en-US"/>
+                <w:sz w:val="22"/>
+                <w:szCs w:val="22"/>
+              </w:rPr>
+              <w:t xml:space="preserve">Không áp dụng lãi chậm thanh toán.</w:t>
+            </w:r>
+          </w:p>
+        </w:tc>
+        <w:tc>
+          <w:tcPr>
+            <w:tcW w:w="3100" w:type="dxa"/>
+            <w:vAlign w:val="center"/>
+          </w:tcPr>
+          <w:p>
+            <w:pPr>
+              <w:spacing w:before="20" w:after="20" w:line="252" w:lineRule="auto"/>
+              <w:ind w:left="0" w:right="0" w:firstLine="0"/>
+              <w:jc w:val="left"/>
+            </w:pPr>
+            <w:r>
+              <w:rPr>
+                <w:rFonts w:cs="Calibri Light" w:ascii="Calibri Light" w:hAnsi="Calibri Light" w:asciiTheme="majorHAnsi" w:cstheme="majorHAnsi" w:hAnsiTheme="majorHAnsi"/>
+                <w:color w:themeColor="text1" w:val="000000"/>
+                <w:lang w:val="en-US"/>
+                <w:sz w:val="22"/>
+                <w:szCs w:val="22"/>
+              </w:rPr>
+              <w:t xml:space="preserve">Biên bản thương thảo ghi 20 ngày; dự thảo hợp đồng chốt 14 ngày.</w:t>
+            </w:r>
+          </w:p>
+        </w:tc>
+      </w:tr>
+      <w:tr>
+        <w:trPr>
+          <w:cantSplit/>
+        </w:trPr>
+        <w:tc>
+          <w:tcPr>
+            <w:tcW w:w="1700" w:type="dxa"/>
+            <w:vAlign w:val="center"/>
+          </w:tcPr>
+          <w:p>
+            <w:pPr>
+              <w:spacing w:before="20" w:after="20" w:line="252" w:lineRule="auto"/>
+              <w:ind w:left="0" w:right="0" w:firstLine="0"/>
+              <w:jc w:val="left"/>
+            </w:pPr>
+            <w:r>
+              <w:rPr>
+                <w:rFonts w:cs="Calibri Light" w:ascii="Calibri Light" w:hAnsi="Calibri Light" w:asciiTheme="majorHAnsi" w:cstheme="majorHAnsi" w:hAnsiTheme="majorHAnsi"/>
+                <w:b/>
+                <w:color w:themeColor="text1" w:val="000000"/>
+                <w:lang w:val="en-US"/>
+                <w:sz w:val="22"/>
+                <w:szCs w:val="22"/>
+              </w:rPr>
+              <w:t xml:space="preserve">Quyết toán</w:t>
+            </w:r>
+          </w:p>
+        </w:tc>
+        <w:tc>
+          <w:tcPr>
+            <w:tcW w:w="4088" w:type="dxa"/>
+            <w:vAlign w:val="center"/>
+          </w:tcPr>
+          <w:p>
+            <w:pPr>
+              <w:spacing w:before="20" w:after="20" w:line="252" w:lineRule="auto"/>
+              <w:ind w:left="0" w:right="0" w:firstLine="0"/>
+              <w:jc w:val="left"/>
+            </w:pPr>
+            <w:r>
+              <w:rPr>
+                <w:rFonts w:cs="Calibri Light" w:ascii="Calibri Light" w:hAnsi="Calibri Light" w:asciiTheme="majorHAnsi" w:cstheme="majorHAnsi" w:hAnsiTheme="majorHAnsi"/>
+                <w:color w:themeColor="text1" w:val="000000"/>
+                <w:lang w:val="en-US"/>
+                <w:sz w:val="22"/>
+                <w:szCs w:val="22"/>
+              </w:rPr>
+              <w:t xml:space="preserve">Phục Hưng nộp hồ sơ trong 30 ngày sau khi hoàn thành; Bên A xác nhận trong 30 ngày, sau khi Chủ đầu tư phê duyệt quyết toán phần việc tương ứng.</w:t>
+            </w:r>
+          </w:p>
+          <w:p>
+            <w:pPr>
+              <w:spacing w:before="20" w:after="20" w:line="252" w:lineRule="auto"/>
+              <w:ind w:left="0" w:right="0" w:firstLine="0"/>
+              <w:jc w:val="left"/>
+            </w:pPr>
+            <w:r>
+              <w:rPr>
+                <w:rFonts w:cs="Calibri Light" w:ascii="Calibri Light" w:hAnsi="Calibri Light" w:asciiTheme="majorHAnsi" w:cstheme="majorHAnsi" w:hAnsiTheme="majorHAnsi"/>
+                <w:color w:themeColor="text1" w:val="000000"/>
+                <w:lang w:val="en-US"/>
+                <w:sz w:val="22"/>
+                <w:szCs w:val="22"/>
+              </w:rPr>
+              <w:t xml:space="preserve">Thanh toán đến 95% giá trị quyết toán trong 30 ngày kể từ ngày xác nhận.</w:t>
+            </w:r>
+          </w:p>
+        </w:tc>
+        <w:tc>
+          <w:tcPr>
+            <w:tcW w:w="3100" w:type="dxa"/>
+            <w:vAlign w:val="center"/>
+          </w:tcPr>
+          <w:p>
+            <w:pPr>
+              <w:spacing w:before="20" w:after="20" w:line="252" w:lineRule="auto"/>
+              <w:ind w:left="0" w:right="0" w:firstLine="0"/>
+              <w:jc w:val="left"/>
+            </w:pPr>
+            <w:r>
+              <w:rPr>
+                <w:rFonts w:cs="Calibri Light" w:ascii="Calibri Light" w:hAnsi="Calibri Light" w:asciiTheme="majorHAnsi" w:cstheme="majorHAnsi" w:hAnsiTheme="majorHAnsi"/>
+                <w:color w:themeColor="text1" w:val="000000"/>
+                <w:lang w:val="en-US"/>
+                <w:sz w:val="22"/>
+                <w:szCs w:val="22"/>
+              </w:rPr>
+              <w:t xml:space="preserve">Dòng tiền phù hợp với quyết toán của Chủ đầu tư.</w:t>
+            </w:r>
+          </w:p>
+        </w:tc>
+      </w:tr>
+      <w:tr>
+        <w:trPr>
+          <w:cantSplit/>
+        </w:trPr>
+        <w:tc>
+          <w:tcPr>
+            <w:tcW w:w="1700" w:type="dxa"/>
+            <w:vAlign w:val="center"/>
+          </w:tcPr>
+          <w:p>
+            <w:pPr>
+              <w:spacing w:before="20" w:after="20" w:line="252" w:lineRule="auto"/>
+              <w:ind w:left="0" w:right="0" w:firstLine="0"/>
+              <w:jc w:val="left"/>
+            </w:pPr>
+            <w:r>
+              <w:rPr>
+                <w:rFonts w:cs="Calibri Light" w:ascii="Calibri Light" w:hAnsi="Calibri Light" w:asciiTheme="majorHAnsi" w:cstheme="majorHAnsi" w:hAnsiTheme="majorHAnsi"/>
+                <w:b/>
+                <w:color w:themeColor="text1" w:val="000000"/>
+                <w:lang w:val="en-US"/>
+                <w:sz w:val="22"/>
+                <w:szCs w:val="22"/>
+              </w:rPr>
+              <w:t xml:space="preserve">Bảo hành</w:t>
+            </w:r>
+          </w:p>
+        </w:tc>
+        <w:tc>
+          <w:tcPr>
+            <w:tcW w:w="4088" w:type="dxa"/>
+            <w:vAlign w:val="center"/>
+          </w:tcPr>
+          <w:p>
+            <w:pPr>
+              <w:spacing w:before="20" w:after="20" w:line="252" w:lineRule="auto"/>
+              <w:ind w:left="0" w:right="0" w:firstLine="0"/>
+              <w:jc w:val="left"/>
+            </w:pPr>
+            <w:r>
+              <w:rPr>
+                <w:rFonts w:cs="Calibri Light" w:ascii="Calibri Light" w:hAnsi="Calibri Light" w:asciiTheme="majorHAnsi" w:cstheme="majorHAnsi" w:hAnsiTheme="majorHAnsi"/>
+                <w:color w:themeColor="text1" w:val="000000"/>
+                <w:lang w:val="en-US"/>
+                <w:sz w:val="22"/>
+                <w:szCs w:val="22"/>
+              </w:rPr>
+              <w:t xml:space="preserve">36 tháng kể từ khi Chủ đầu tư nghiệm thu hoàn thành, không ngắn hơn thời hạn theo Hợp đồng thầu chính.</w:t>
+            </w:r>
+          </w:p>
+          <w:p>
+            <w:pPr>
+              <w:spacing w:before="20" w:after="20" w:line="252" w:lineRule="auto"/>
+              <w:ind w:left="0" w:right="0" w:firstLine="0"/>
+              <w:jc w:val="left"/>
+            </w:pPr>
+            <w:r>
+              <w:rPr>
+                <w:rFonts w:cs="Calibri Light" w:ascii="Calibri Light" w:hAnsi="Calibri Light" w:asciiTheme="majorHAnsi" w:cstheme="majorHAnsi" w:hAnsiTheme="majorHAnsi"/>
+                <w:color w:themeColor="text1" w:val="000000"/>
+                <w:lang w:val="en-US"/>
+                <w:sz w:val="22"/>
+                <w:szCs w:val="22"/>
+              </w:rPr>
+              <w:t xml:space="preserve">Giữ lại 5% giá trị quyết toán, hoàn trả trong 30 ngày làm việc sau khi hết bảo hành, hoặc thay bằng bảo lãnh bảo hành.</w:t>
+            </w:r>
+          </w:p>
+        </w:tc>
+        <w:tc>
+          <w:tcPr>
+            <w:tcW w:w="3100" w:type="dxa"/>
+            <w:vAlign w:val="center"/>
+          </w:tcPr>
+          <w:p>
+            <w:pPr>
+              <w:spacing w:before="20" w:after="20" w:line="252" w:lineRule="auto"/>
+              <w:ind w:left="0" w:right="0" w:firstLine="0"/>
+              <w:jc w:val="left"/>
+            </w:pPr>
+          </w:p>
+        </w:tc>
+      </w:tr>
+      <w:tr>
+        <w:trPr>
+          <w:cantSplit/>
+        </w:trPr>
+        <w:tc>
+          <w:tcPr>
+            <w:tcW w:w="1700" w:type="dxa"/>
+            <w:vAlign w:val="center"/>
+          </w:tcPr>
+          <w:p>
+            <w:pPr>
+              <w:spacing w:before="20" w:after="20" w:line="252" w:lineRule="auto"/>
+              <w:ind w:left="0" w:right="0" w:firstLine="0"/>
+              <w:jc w:val="left"/>
+            </w:pPr>
+            <w:r>
+              <w:rPr>
+                <w:rFonts w:cs="Calibri Light" w:ascii="Calibri Light" w:hAnsi="Calibri Light" w:asciiTheme="majorHAnsi" w:cstheme="majorHAnsi" w:hAnsiTheme="majorHAnsi"/>
+                <w:b/>
+                <w:color w:themeColor="text1" w:val="000000"/>
+                <w:lang w:val="en-US"/>
+                <w:sz w:val="22"/>
+                <w:szCs w:val="22"/>
+              </w:rPr>
+              <w:t xml:space="preserve">Bảo lãnh của Phục Hưng</w:t>
+            </w:r>
+          </w:p>
+        </w:tc>
+        <w:tc>
+          <w:tcPr>
+            <w:tcW w:w="4088" w:type="dxa"/>
+            <w:vAlign w:val="center"/>
+          </w:tcPr>
+          <w:p>
+            <w:pPr>
+              <w:spacing w:before="20" w:after="20" w:line="252" w:lineRule="auto"/>
+              <w:ind w:left="0" w:right="0" w:firstLine="0"/>
+              <w:jc w:val="left"/>
+            </w:pPr>
+            <w:r>
+              <w:rPr>
+                <w:rFonts w:cs="Calibri Light" w:ascii="Calibri Light" w:hAnsi="Calibri Light" w:asciiTheme="majorHAnsi" w:cstheme="majorHAnsi" w:hAnsiTheme="majorHAnsi"/>
+                <w:color w:themeColor="text1" w:val="000000"/>
+                <w:lang w:val="en-US"/>
+                <w:sz w:val="22"/>
+                <w:szCs w:val="22"/>
+              </w:rPr>
+              <w:t xml:space="preserve">Bảo lãnh tạm ứng: 100% giá trị tạm ứng.</w:t>
+            </w:r>
+          </w:p>
+          <w:p>
+            <w:pPr>
+              <w:spacing w:before="20" w:after="20" w:line="252" w:lineRule="auto"/>
+              <w:ind w:left="0" w:right="0" w:firstLine="0"/>
+              <w:jc w:val="left"/>
+            </w:pPr>
+            <w:r>
+              <w:rPr>
+                <w:rFonts w:cs="Calibri Light" w:ascii="Calibri Light" w:hAnsi="Calibri Light" w:asciiTheme="majorHAnsi" w:cstheme="majorHAnsi" w:hAnsiTheme="majorHAnsi"/>
+                <w:color w:themeColor="text1" w:val="000000"/>
+                <w:lang w:val="en-US"/>
+                <w:sz w:val="22"/>
+                <w:szCs w:val="22"/>
+              </w:rPr>
+              <w:t xml:space="preserve">Bảo lãnh thực hiện hợp đồng: 5% giá trị hợp đồng, nộp trong 14 ngày kể từ ngày ký.</w:t>
+            </w:r>
+          </w:p>
+          <w:p>
+            <w:pPr>
+              <w:spacing w:before="20" w:after="20" w:line="252" w:lineRule="auto"/>
+              <w:ind w:left="0" w:right="0" w:firstLine="0"/>
+              <w:jc w:val="left"/>
+            </w:pPr>
+            <w:r>
+              <w:rPr>
+                <w:rFonts w:cs="Calibri Light" w:ascii="Calibri Light" w:hAnsi="Calibri Light" w:asciiTheme="majorHAnsi" w:cstheme="majorHAnsi" w:hAnsiTheme="majorHAnsi"/>
+                <w:color w:themeColor="text1" w:val="000000"/>
+                <w:lang w:val="en-US"/>
+                <w:sz w:val="22"/>
+                <w:szCs w:val="22"/>
+              </w:rPr>
+              <w:t xml:space="preserve">Bảo lãnh bảo hành: 5% giá trị quyết toán.</w:t>
+            </w:r>
+          </w:p>
+        </w:tc>
+        <w:tc>
+          <w:tcPr>
+            <w:tcW w:w="3100" w:type="dxa"/>
+            <w:vAlign w:val="center"/>
+          </w:tcPr>
+          <w:p>
+            <w:pPr>
+              <w:spacing w:before="20" w:after="20" w:line="252" w:lineRule="auto"/>
+              <w:ind w:left="0" w:right="0" w:firstLine="0"/>
+              <w:jc w:val="left"/>
+            </w:pPr>
+          </w:p>
+        </w:tc>
+      </w:tr>
+      <w:tr>
+        <w:trPr>
+          <w:cantSplit/>
+        </w:trPr>
+        <w:tc>
+          <w:tcPr>
+            <w:tcW w:w="1700" w:type="dxa"/>
+            <w:vAlign w:val="center"/>
+          </w:tcPr>
+          <w:p>
+            <w:pPr>
+              <w:spacing w:before="20" w:after="20" w:line="252" w:lineRule="auto"/>
+              <w:ind w:left="0" w:right="0" w:firstLine="0"/>
+              <w:jc w:val="left"/>
+            </w:pPr>
+            <w:r>
+              <w:rPr>
+                <w:rFonts w:cs="Calibri Light" w:ascii="Calibri Light" w:hAnsi="Calibri Light" w:asciiTheme="majorHAnsi" w:cstheme="majorHAnsi" w:hAnsiTheme="majorHAnsi"/>
+                <w:b/>
+                <w:color w:themeColor="text1" w:val="000000"/>
+                <w:lang w:val="en-US"/>
+                <w:sz w:val="22"/>
+                <w:szCs w:val="22"/>
+              </w:rPr>
+              <w:t xml:space="preserve">Bảo lãnh thanh toán của VNCN E&amp;C</w:t>
+            </w:r>
+          </w:p>
+        </w:tc>
+        <w:tc>
+          <w:tcPr>
+            <w:tcW w:w="4088" w:type="dxa"/>
+            <w:vAlign w:val="center"/>
+          </w:tcPr>
+          <w:p>
+            <w:pPr>
+              <w:spacing w:before="20" w:after="20" w:line="252" w:lineRule="auto"/>
+              <w:ind w:left="0" w:right="0" w:firstLine="0"/>
+              <w:jc w:val="left"/>
+            </w:pPr>
+            <w:r>
+              <w:rPr>
+                <w:rFonts w:cs="Calibri Light" w:ascii="Calibri Light" w:hAnsi="Calibri Light" w:asciiTheme="majorHAnsi" w:cstheme="majorHAnsi" w:hAnsiTheme="majorHAnsi"/>
+                <w:b/>
+                <w:color w:themeColor="text1" w:val="000000"/>
+                <w:lang w:val="en-US"/>
+                <w:sz w:val="22"/>
+                <w:szCs w:val="22"/>
+              </w:rPr>
+              <w:t xml:space="preserve">Không áp dụng.</w:t>
+            </w:r>
+          </w:p>
+        </w:tc>
+        <w:tc>
+          <w:tcPr>
+            <w:tcW w:w="3100" w:type="dxa"/>
+            <w:vAlign w:val="center"/>
+          </w:tcPr>
+          <w:p>
+            <w:pPr>
+              <w:spacing w:before="20" w:after="20" w:line="252" w:lineRule="auto"/>
+              <w:ind w:left="0" w:right="0" w:firstLine="0"/>
+              <w:jc w:val="left"/>
+            </w:pPr>
+            <w:r>
+              <w:rPr>
+                <w:rFonts w:cs="Calibri Light" w:ascii="Calibri Light" w:hAnsi="Calibri Light" w:asciiTheme="majorHAnsi" w:cstheme="majorHAnsi" w:hAnsiTheme="majorHAnsi"/>
+                <w:color w:themeColor="text1" w:val="000000"/>
+                <w:lang w:val="en-US"/>
+                <w:sz w:val="22"/>
+                <w:szCs w:val="22"/>
+              </w:rPr>
+              <w:t xml:space="preserve">Phục Hưng đề nghị bảo lãnh 15% giá trị hợp đồng (≈ 32,45 tỷ đồng); BCH đề xuất không chấp thuận.</w:t>
+            </w:r>
+          </w:p>
+        </w:tc>
+      </w:tr>
+      <w:tr>
+        <w:trPr>
+          <w:cantSplit/>
+        </w:trPr>
+        <w:tc>
+          <w:tcPr>
+            <w:tcW w:w="1700" w:type="dxa"/>
+            <w:vAlign w:val="center"/>
+          </w:tcPr>
+          <w:p>
+            <w:pPr>
+              <w:spacing w:before="20" w:after="20" w:line="252" w:lineRule="auto"/>
+              <w:ind w:left="0" w:right="0" w:firstLine="0"/>
+              <w:jc w:val="left"/>
+            </w:pPr>
+            <w:r>
+              <w:rPr>
+                <w:rFonts w:cs="Calibri Light" w:ascii="Calibri Light" w:hAnsi="Calibri Light" w:asciiTheme="majorHAnsi" w:cstheme="majorHAnsi" w:hAnsiTheme="majorHAnsi"/>
+                <w:b/>
+                <w:color w:themeColor="text1" w:val="000000"/>
+                <w:lang w:val="en-US"/>
+                <w:sz w:val="22"/>
+                <w:szCs w:val="22"/>
+              </w:rPr>
+              <w:t xml:space="preserve">Phạt vi phạm</w:t>
+            </w:r>
+          </w:p>
+        </w:tc>
+        <w:tc>
+          <w:tcPr>
+            <w:tcW w:w="4088" w:type="dxa"/>
+            <w:vAlign w:val="center"/>
+          </w:tcPr>
+          <w:p>
+            <w:pPr>
+              <w:spacing w:before="20" w:after="20" w:line="252" w:lineRule="auto"/>
+              <w:ind w:left="0" w:right="0" w:firstLine="0"/>
+              <w:jc w:val="left"/>
+            </w:pPr>
+            <w:r>
+              <w:rPr>
+                <w:rFonts w:cs="Calibri Light" w:ascii="Calibri Light" w:hAnsi="Calibri Light" w:asciiTheme="majorHAnsi" w:cstheme="majorHAnsi" w:hAnsiTheme="majorHAnsi"/>
+                <w:color w:themeColor="text1" w:val="000000"/>
+                <w:lang w:val="en-US"/>
+                <w:sz w:val="22"/>
+                <w:szCs w:val="22"/>
+              </w:rPr>
+              <w:t xml:space="preserve">Chậm tiến độ 0,1%/ngày, tối đa 8%; tổng mức phạt không quá 10% giá trị hợp đồng.</w:t>
+            </w:r>
+          </w:p>
+        </w:tc>
+        <w:tc>
+          <w:tcPr>
+            <w:tcW w:w="3100" w:type="dxa"/>
+            <w:vAlign w:val="center"/>
+          </w:tcPr>
+          <w:p>
+            <w:pPr>
+              <w:spacing w:before="20" w:after="20" w:line="252" w:lineRule="auto"/>
+              <w:ind w:left="0" w:right="0" w:firstLine="0"/>
+              <w:jc w:val="left"/>
+            </w:pPr>
+          </w:p>
+        </w:tc>
+      </w:tr>
+      <w:tr>
+        <w:trPr>
+          <w:cantSplit/>
+        </w:trPr>
+        <w:tc>
+          <w:tcPr>
+            <w:tcW w:w="1700" w:type="dxa"/>
+            <w:vAlign w:val="center"/>
+          </w:tcPr>
+          <w:p>
+            <w:pPr>
+              <w:spacing w:before="20" w:after="20" w:line="252" w:lineRule="auto"/>
+              <w:ind w:left="0" w:right="0" w:firstLine="0"/>
+              <w:jc w:val="left"/>
+            </w:pPr>
+            <w:r>
+              <w:rPr>
+                <w:rFonts w:cs="Calibri Light" w:ascii="Calibri Light" w:hAnsi="Calibri Light" w:asciiTheme="majorHAnsi" w:cstheme="majorHAnsi" w:hAnsiTheme="majorHAnsi"/>
+                <w:b/>
+                <w:color w:themeColor="text1" w:val="000000"/>
+                <w:lang w:val="en-US"/>
+                <w:sz w:val="22"/>
+                <w:szCs w:val="22"/>
+              </w:rPr>
+              <w:t xml:space="preserve">Tiến độ</w:t>
+            </w:r>
+          </w:p>
+        </w:tc>
+        <w:tc>
+          <w:tcPr>
+            <w:tcW w:w="4088" w:type="dxa"/>
+            <w:vAlign w:val="center"/>
+          </w:tcPr>
+          <w:p>
+            <w:pPr>
+              <w:spacing w:before="20" w:after="20" w:line="252" w:lineRule="auto"/>
+              <w:ind w:left="0" w:right="0" w:firstLine="0"/>
+              <w:jc w:val="left"/>
+            </w:pPr>
+            <w:r>
+              <w:rPr>
+                <w:rFonts w:cs="Calibri Light" w:ascii="Calibri Light" w:hAnsi="Calibri Light" w:asciiTheme="majorHAnsi" w:cstheme="majorHAnsi" w:hAnsiTheme="majorHAnsi"/>
+                <w:color w:themeColor="text1" w:val="000000"/>
+                <w:lang w:val="en-US"/>
+                <w:sz w:val="22"/>
+                <w:szCs w:val="22"/>
+              </w:rPr>
+              <w:t xml:space="preserve">Để ngỏ (Điều 7.1).</w:t>
+            </w:r>
+          </w:p>
+        </w:tc>
+        <w:tc>
+          <w:tcPr>
+            <w:tcW w:w="3100" w:type="dxa"/>
+            <w:vAlign w:val="center"/>
+          </w:tcPr>
+          <w:p>
+            <w:pPr>
+              <w:spacing w:before="20" w:after="20" w:line="252" w:lineRule="auto"/>
+              <w:ind w:left="0" w:right="0" w:firstLine="0"/>
+              <w:jc w:val="left"/>
+            </w:pPr>
+            <w:r>
+              <w:rPr>
+                <w:rFonts w:cs="Calibri Light" w:ascii="Calibri Light" w:hAnsi="Calibri Light" w:asciiTheme="majorHAnsi" w:cstheme="majorHAnsi" w:hAnsiTheme="majorHAnsi"/>
+                <w:color w:themeColor="text1" w:val="000000"/>
+                <w:lang w:val="en-US"/>
+                <w:sz w:val="22"/>
+                <w:szCs w:val="22"/>
+              </w:rPr>
+              <w:t xml:space="preserve">Hai bên tiếp tục thống nhất.</w:t>
+            </w:r>
+          </w:p>
+        </w:tc>
+      </w:tr>
+    </w:tbl>
     <w:p>
       <w:pPr>
         <w:pStyle w:val="ListParagraph"/>
@@ -1914,6 +3067,7 @@
     <w:p>
       <w:pPr>
         <w:pStyle w:val="ListParagraph"/>
+        <w:keepNext/>
         <w:numPr>
           <w:ilvl w:val="0"/>
           <w:numId w:val="0"/>
@@ -1941,6 +3095,7 @@
     <w:p>
       <w:pPr>
         <w:pStyle w:val="Normal"/>
+        <w:keepNext/>
         <w:spacing w:before="0" w:after="120"/>
         <w:ind w:left="0"/>
         <w:rPr>
@@ -1961,6 +3116,7 @@
     <w:p>
       <w:pPr>
         <w:pStyle w:val="Normal"/>
+        <w:keepNext/>
         <w:spacing w:before="0" w:after="120"/>
         <w:ind w:left="0"/>
         <w:rPr>
@@ -2006,6 +3162,7 @@
       </w:tblGrid>
       <w:tr>
         <w:trPr>
+          <w:cantSplit/>
           <w:trHeight w:val="1708" w:hRule="atLeast"/>
         </w:trPr>
         <w:tc>
@@ -2021,6 +3178,7 @@
           <w:p>
             <w:pPr>
               <w:pStyle w:val="Normal"/>
+              <w:keepNext/>
               <w:spacing w:before="0" w:after="120"/>
               <w:ind w:left="0"/>
               <w:jc w:val="center"/>
@@ -2046,6 +3204,7 @@
           <w:p>
             <w:pPr>
               <w:pStyle w:val="Normal"/>
+              <w:keepNext/>
               <w:spacing w:before="0" w:after="120"/>
               <w:ind w:left="0"/>
               <w:jc w:val="center"/>
@@ -2068,6 +3227,7 @@
           <w:p>
             <w:pPr>
               <w:pStyle w:val="Normal"/>
+              <w:keepNext/>
               <w:spacing w:before="0" w:after="120"/>
               <w:ind w:left="0"/>
               <w:jc w:val="center"/>
@@ -2090,6 +3250,7 @@
           <w:p>
             <w:pPr>
               <w:pStyle w:val="Normal"/>
+              <w:keepNext/>
               <w:spacing w:before="0" w:after="120"/>
               <w:ind w:left="0"/>
               <w:jc w:val="center"/>
@@ -2112,6 +3273,7 @@
           <w:p>
             <w:pPr>
               <w:pStyle w:val="Normal"/>
+              <w:keepNext/>
               <w:spacing w:before="0" w:after="120"/>
               <w:ind w:left="0"/>
               <w:rPr>
@@ -2133,6 +3295,7 @@
           <w:p>
             <w:pPr>
               <w:pStyle w:val="Normal"/>
+              <w:keepNext/>
               <w:spacing w:before="0" w:after="120"/>
               <w:ind w:left="0"/>
               <w:jc w:val="center"/>
@@ -2166,6 +3329,7 @@
           <w:p>
             <w:pPr>
               <w:pStyle w:val="Normal"/>
+              <w:keepNext/>
               <w:spacing w:before="0" w:after="120"/>
               <w:ind w:left="0"/>
               <w:jc w:val="center"/>
@@ -2201,6 +3365,7 @@
           <w:p>
             <w:pPr>
               <w:pStyle w:val="Normal"/>
+              <w:keepNext/>
               <w:spacing w:before="0" w:after="120"/>
               <w:ind w:left="0"/>
               <w:jc w:val="center"/>
@@ -2226,6 +3391,7 @@
           <w:p>
             <w:pPr>
               <w:pStyle w:val="Normal"/>
+              <w:keepNext/>
               <w:spacing w:before="0" w:after="120"/>
               <w:ind w:left="0"/>
               <w:jc w:val="center"/>
@@ -2250,6 +3416,7 @@
           <w:p>
             <w:pPr>
               <w:pStyle w:val="Normal"/>
+              <w:keepNext/>
               <w:spacing w:before="0" w:after="120"/>
               <w:ind w:left="0"/>
               <w:jc w:val="center"/>
@@ -2274,6 +3441,7 @@
           <w:p>
             <w:pPr>
               <w:pStyle w:val="Normal"/>
+              <w:keepNext/>
               <w:spacing w:before="0" w:after="120"/>
               <w:ind w:left="0"/>
               <w:jc w:val="center"/>
@@ -2298,6 +3466,7 @@
           <w:p>
             <w:pPr>
               <w:pStyle w:val="Normal"/>
+              <w:keepNext/>
               <w:spacing w:before="0" w:after="120"/>
               <w:ind w:left="0"/>
               <w:jc w:val="center"/>
@@ -2336,6 +3505,7 @@
           <w:p>
             <w:pPr>
               <w:pStyle w:val="Normal"/>
+              <w:keepNext/>
               <w:spacing w:before="0" w:after="120"/>
               <w:ind w:left="0"/>
               <w:jc w:val="center"/>
@@ -2361,6 +3531,7 @@
           <w:p>
             <w:pPr>
               <w:pStyle w:val="Normal"/>
+              <w:keepNext/>
               <w:spacing w:before="0" w:after="120"/>
               <w:ind w:left="0"/>
               <w:jc w:val="center"/>
@@ -2385,6 +3556,7 @@
           <w:p>
             <w:pPr>
               <w:pStyle w:val="Normal"/>
+              <w:keepNext/>
               <w:spacing w:before="0" w:after="120"/>
               <w:ind w:left="0"/>
               <w:jc w:val="center"/>
@@ -2409,6 +3581,7 @@
           <w:p>
             <w:pPr>
               <w:pStyle w:val="Normal"/>
+              <w:keepNext/>
               <w:spacing w:before="0" w:after="120"/>
               <w:ind w:left="0"/>
               <w:jc w:val="center"/>
@@ -2433,6 +3606,7 @@
           <w:p>
             <w:pPr>
               <w:pStyle w:val="Normal"/>
+              <w:keepNext/>
               <w:spacing w:before="0" w:after="120"/>
               <w:ind w:left="0"/>
               <w:jc w:val="center"/>
@@ -2457,6 +3631,7 @@
           <w:p>
             <w:pPr>
               <w:pStyle w:val="Normal"/>
+              <w:keepNext/>
               <w:spacing w:before="0" w:after="120"/>
               <w:ind w:left="0"/>
               <w:jc w:val="center"/>
@@ -2485,6 +3660,7 @@
       </w:tr>
       <w:tr>
         <w:trPr>
+          <w:cantSplit/>
           <w:trHeight w:val="1947" w:hRule="atLeast"/>
         </w:trPr>
         <w:tc>

</xml_diff>